<commit_message>
Refresh SBLGNT data for 2026-10-02 release
</commit_message>
<xml_diff>
--- a/grc/docx/48.content.docx
+++ b/grc/docx/48.content.docx
@@ -7,7 +7,7 @@
       <w:pPr/>
       <w:r>
         <w:rPr>
-          <w:lang w:val="en_US" w:bidi="en_US"/>
+          <w:lang w:val="el_GR" w:bidi="el_GR"/>
         </w:rPr>
       </w:r>
     </w:p>
@@ -17,40 +17,40 @@
       </w:pPr>
       <w:r>
         <w:rPr>
-          <w:lang w:val="en_US" w:bidi="en_US"/>
+          <w:lang w:val="el_GR" w:bidi="el_GR"/>
         </w:rPr>
         <w:t>Resource: The SBL Greek New Testament</w:t>
       </w:r>
       <w:r>
         <w:rPr>
-          <w:lang w:val="en_US" w:bidi="en_US"/>
-        </w:rPr>
-      </w:r>
-    </w:p>
-    <w:p>
-      <w:pPr/>
-      <w:r>
-        <w:rPr>
-          <w:lang w:val="en_US" w:bidi="en_US"/>
+          <w:lang w:val="el_GR" w:bidi="el_GR"/>
+        </w:rPr>
+      </w:r>
+    </w:p>
+    <w:p>
+      <w:pPr/>
+      <w:r>
+        <w:rPr>
+          <w:lang w:val="el_GR" w:bidi="el_GR"/>
         </w:rPr>
       </w:r>
       <w:r>
         <w:rPr>
           <w:b/>
-          <w:lang w:val="en_US" w:bidi="en_US"/>
+          <w:lang w:val="el_GR" w:bidi="el_GR"/>
         </w:rPr>
         <w:t>The SBL Greek New Testament</w:t>
       </w:r>
       <w:r>
         <w:rPr>
-          <w:lang w:val="en_US" w:bidi="en_US"/>
+          <w:lang w:val="el_GR" w:bidi="el_GR"/>
         </w:rPr>
         <w:t xml:space="preserve"> © 2010 </w:t>
       </w:r>
       <w:hyperlink r:id="rId13">
         <w:r>
           <w:rPr>
-            <w:lang w:val="en_US" w:bidi="en_US"/>
+            <w:lang w:val="el_GR" w:bidi="el_GR"/>
           </w:rPr>
           <w:rPr>
             <w:color w:val="0000EE"/>
@@ -61,14 +61,14 @@
       </w:hyperlink>
       <w:r>
         <w:rPr>
-          <w:lang w:val="en_US" w:bidi="en_US"/>
+          <w:lang w:val="el_GR" w:bidi="el_GR"/>
         </w:rPr>
         <w:t xml:space="preserve">, licensed under a </w:t>
       </w:r>
       <w:hyperlink r:id="rId14">
         <w:r>
           <w:rPr>
-            <w:lang w:val="en_US" w:bidi="en_US"/>
+            <w:lang w:val="el_GR" w:bidi="el_GR"/>
           </w:rPr>
           <w:rPr>
             <w:color w:val="0000EE"/>
@@ -79,18 +79,18 @@
       </w:hyperlink>
       <w:r>
         <w:rPr>
-          <w:lang w:val="en_US" w:bidi="en_US"/>
+          <w:lang w:val="el_GR" w:bidi="el_GR"/>
         </w:rPr>
         <w:t>.</w:t>
       </w:r>
       <w:r>
         <w:rPr>
-          <w:lang w:val="en_US" w:bidi="en_US"/>
-        </w:rPr>
-      </w:r>
-      <w:r>
-        <w:rPr>
-          <w:lang w:val="en_US" w:bidi="en_US"/>
+          <w:lang w:val="el_GR" w:bidi="el_GR"/>
+        </w:rPr>
+      </w:r>
+      <w:r>
+        <w:rPr>
+          <w:lang w:val="el_GR" w:bidi="el_GR"/>
         </w:rPr>
       </w:r>
     </w:p>
@@ -100,7 +100,7 @@
       </w:pPr>
       <w:r>
         <w:rPr>
-          <w:lang w:val="en_US" w:bidi="en_US"/>
+          <w:lang w:val="el_GR" w:bidi="el_GR"/>
         </w:rPr>
         <w:t>The SBL Greek New Testament</w:t>
       </w:r>
@@ -127,7 +127,7 @@
       <w:pPr/>
       <w:r>
         <w:rPr>
-          <w:lang w:val="en_US" w:bidi="en_US"/>
+          <w:lang w:val="el_GR" w:bidi="el_GR"/>
         </w:rPr>
       </w:r>
     </w:p>
@@ -137,31 +137,31 @@
       </w:pPr>
       <w:r>
         <w:rPr>
-          <w:lang w:val="en_US" w:bidi="en_US"/>
-        </w:rPr>
-      </w:r>
-    </w:p>
-    <w:p>
-      <w:pPr/>
-      <w:r>
-        <w:rPr>
-          <w:lang w:val="en_US" w:bidi="en_US"/>
-        </w:rPr>
-      </w:r>
-      <w:r>
-        <w:rPr>
-          <w:lang w:val="en_US" w:bidi="en_US"/>
+          <w:lang w:val="el_GR" w:bidi="el_GR"/>
+        </w:rPr>
+      </w:r>
+    </w:p>
+    <w:p>
+      <w:pPr/>
+      <w:r>
+        <w:rPr>
+          <w:lang w:val="el_GR" w:bidi="el_GR"/>
+        </w:rPr>
+      </w:r>
+      <w:r>
+        <w:rPr>
+          <w:lang w:val="el_GR" w:bidi="el_GR"/>
         </w:rPr>
         <w:t xml:space="preserve"> </w:t>
       </w:r>
       <w:r>
         <w:rPr>
-          <w:lang w:val="en_US" w:bidi="en_US"/>
-        </w:rPr>
-      </w:r>
-      <w:r>
-        <w:rPr>
-          <w:lang w:val="en_US" w:bidi="en_US"/>
+          <w:lang w:val="el_GR" w:bidi="el_GR"/>
+        </w:rPr>
+      </w:r>
+      <w:r>
+        <w:rPr>
+          <w:lang w:val="el_GR" w:bidi="el_GR"/>
         </w:rPr>
       </w:r>
     </w:p>
@@ -186,33 +186,33 @@
       </w:pPr>
       <w:r>
         <w:rPr>
-          <w:lang w:val="en_US" w:bidi="en_US"/>
+          <w:lang w:val="el_GR" w:bidi="el_GR"/>
         </w:rPr>
         <w:t>Galatians 1:1</w:t>
       </w:r>
       <w:r>
         <w:rPr>
-          <w:lang w:val="en_US" w:bidi="en_US"/>
-        </w:rPr>
-      </w:r>
-    </w:p>
-    <w:p>
-      <w:pPr/>
-      <w:r>
-        <w:rPr>
-          <w:lang w:val="en_US" w:bidi="en_US"/>
-        </w:rPr>
-      </w:r>
-      <w:r>
-        <w:rPr>
-          <w:vertAlign w:val="superscript"/>
-          <w:lang w:val="en_US" w:bidi="en_US"/>
+          <w:lang w:val="el_GR" w:bidi="el_GR"/>
+        </w:rPr>
+      </w:r>
+    </w:p>
+    <w:p>
+      <w:pPr/>
+      <w:r>
+        <w:rPr>
+          <w:lang w:val="el_GR" w:bidi="el_GR"/>
+        </w:rPr>
+      </w:r>
+      <w:r>
+        <w:rPr>
+          <w:vertAlign w:val="superscript"/>
+          <w:lang w:val="el_GR" w:bidi="el_GR"/>
         </w:rPr>
         <w:t>1</w:t>
       </w:r>
       <w:r>
         <w:rPr>
-          <w:lang w:val="en_US" w:bidi="en_US"/>
+          <w:lang w:val="el_GR" w:bidi="el_GR"/>
         </w:rPr>
         <w:t xml:space="preserve"> Παῦλος ἀπόστολος, οὐκ ἀπʼ ἀνθρώπων οὐδὲ διʼ ἀνθρώπου ἀλλὰ διὰ Ἰησοῦ Χριστοῦ καὶ θεοῦ πατρὸς τοῦ ἐγείραντος αὐτὸν ἐκ νεκρῶν,</w:t>
       </w:r>
@@ -221,19 +221,19 @@
       <w:pPr/>
       <w:r>
         <w:rPr>
-          <w:lang w:val="en_US" w:bidi="en_US"/>
-        </w:rPr>
-      </w:r>
-      <w:r>
-        <w:rPr>
-          <w:vertAlign w:val="superscript"/>
-          <w:lang w:val="en_US" w:bidi="en_US"/>
+          <w:lang w:val="el_GR" w:bidi="el_GR"/>
+        </w:rPr>
+      </w:r>
+      <w:r>
+        <w:rPr>
+          <w:vertAlign w:val="superscript"/>
+          <w:lang w:val="el_GR" w:bidi="el_GR"/>
         </w:rPr>
         <w:t>2</w:t>
       </w:r>
       <w:r>
         <w:rPr>
-          <w:lang w:val="en_US" w:bidi="en_US"/>
+          <w:lang w:val="el_GR" w:bidi="el_GR"/>
         </w:rPr>
         <w:t xml:space="preserve"> καὶ οἱ σὺν ἐμοὶ πάντες ἀδελφοί, ταῖς ἐκκλησίαις τῆς Γαλατίας·</w:t>
       </w:r>
@@ -242,19 +242,19 @@
       <w:pPr/>
       <w:r>
         <w:rPr>
-          <w:lang w:val="en_US" w:bidi="en_US"/>
-        </w:rPr>
-      </w:r>
-      <w:r>
-        <w:rPr>
-          <w:vertAlign w:val="superscript"/>
-          <w:lang w:val="en_US" w:bidi="en_US"/>
+          <w:lang w:val="el_GR" w:bidi="el_GR"/>
+        </w:rPr>
+      </w:r>
+      <w:r>
+        <w:rPr>
+          <w:vertAlign w:val="superscript"/>
+          <w:lang w:val="el_GR" w:bidi="el_GR"/>
         </w:rPr>
         <w:t>3</w:t>
       </w:r>
       <w:r>
         <w:rPr>
-          <w:lang w:val="en_US" w:bidi="en_US"/>
+          <w:lang w:val="el_GR" w:bidi="el_GR"/>
         </w:rPr>
         <w:t xml:space="preserve"> χάρις ὑμῖν καὶ εἰρήνη ἀπὸ θεοῦ πατρὸς καὶ κυρίου ἡμῶν Ἰησοῦ Χριστοῦ,</w:t>
       </w:r>
@@ -263,19 +263,19 @@
       <w:pPr/>
       <w:r>
         <w:rPr>
-          <w:lang w:val="en_US" w:bidi="en_US"/>
-        </w:rPr>
-      </w:r>
-      <w:r>
-        <w:rPr>
-          <w:vertAlign w:val="superscript"/>
-          <w:lang w:val="en_US" w:bidi="en_US"/>
+          <w:lang w:val="el_GR" w:bidi="el_GR"/>
+        </w:rPr>
+      </w:r>
+      <w:r>
+        <w:rPr>
+          <w:vertAlign w:val="superscript"/>
+          <w:lang w:val="el_GR" w:bidi="el_GR"/>
         </w:rPr>
         <w:t>4</w:t>
       </w:r>
       <w:r>
         <w:rPr>
-          <w:lang w:val="en_US" w:bidi="en_US"/>
+          <w:lang w:val="el_GR" w:bidi="el_GR"/>
         </w:rPr>
         <w:t xml:space="preserve"> τοῦ δόντος ἑαυτὸν ὑπὲρ τῶν ἁμαρτιῶν ἡμῶν ὅπως ἐξέληται ἡμᾶς ἐκ τοῦ αἰῶνος τοῦ ἐνεστῶτος πονηροῦ κατὰ τὸ θέλημα τοῦ θεοῦ καὶ πατρὸς ἡμῶν,</w:t>
       </w:r>
@@ -284,19 +284,19 @@
       <w:pPr/>
       <w:r>
         <w:rPr>
-          <w:lang w:val="en_US" w:bidi="en_US"/>
-        </w:rPr>
-      </w:r>
-      <w:r>
-        <w:rPr>
-          <w:vertAlign w:val="superscript"/>
-          <w:lang w:val="en_US" w:bidi="en_US"/>
+          <w:lang w:val="el_GR" w:bidi="el_GR"/>
+        </w:rPr>
+      </w:r>
+      <w:r>
+        <w:rPr>
+          <w:vertAlign w:val="superscript"/>
+          <w:lang w:val="el_GR" w:bidi="el_GR"/>
         </w:rPr>
         <w:t>5</w:t>
       </w:r>
       <w:r>
         <w:rPr>
-          <w:lang w:val="en_US" w:bidi="en_US"/>
+          <w:lang w:val="el_GR" w:bidi="el_GR"/>
         </w:rPr>
         <w:t xml:space="preserve"> ᾧ ἡ δόξα εἰς τοὺς αἰῶνας τῶν αἰώνων· ἀμήν.</w:t>
       </w:r>
@@ -305,19 +305,19 @@
       <w:pPr/>
       <w:r>
         <w:rPr>
-          <w:lang w:val="en_US" w:bidi="en_US"/>
-        </w:rPr>
-      </w:r>
-      <w:r>
-        <w:rPr>
-          <w:vertAlign w:val="superscript"/>
-          <w:lang w:val="en_US" w:bidi="en_US"/>
+          <w:lang w:val="el_GR" w:bidi="el_GR"/>
+        </w:rPr>
+      </w:r>
+      <w:r>
+        <w:rPr>
+          <w:vertAlign w:val="superscript"/>
+          <w:lang w:val="el_GR" w:bidi="el_GR"/>
         </w:rPr>
         <w:t>6</w:t>
       </w:r>
       <w:r>
         <w:rPr>
-          <w:lang w:val="en_US" w:bidi="en_US"/>
+          <w:lang w:val="el_GR" w:bidi="el_GR"/>
         </w:rPr>
         <w:t xml:space="preserve"> Θαυμάζω ὅτι οὕτως ταχέως μετατίθεσθε ἀπὸ τοῦ καλέσαντος ὑμᾶς ἐν χάριτι Χριστοῦ εἰς ἕτερον εὐαγγέλιον,</w:t>
       </w:r>
@@ -326,19 +326,19 @@
       <w:pPr/>
       <w:r>
         <w:rPr>
-          <w:lang w:val="en_US" w:bidi="en_US"/>
-        </w:rPr>
-      </w:r>
-      <w:r>
-        <w:rPr>
-          <w:vertAlign w:val="superscript"/>
-          <w:lang w:val="en_US" w:bidi="en_US"/>
+          <w:lang w:val="el_GR" w:bidi="el_GR"/>
+        </w:rPr>
+      </w:r>
+      <w:r>
+        <w:rPr>
+          <w:vertAlign w:val="superscript"/>
+          <w:lang w:val="el_GR" w:bidi="el_GR"/>
         </w:rPr>
         <w:t>7</w:t>
       </w:r>
       <w:r>
         <w:rPr>
-          <w:lang w:val="en_US" w:bidi="en_US"/>
+          <w:lang w:val="el_GR" w:bidi="el_GR"/>
         </w:rPr>
         <w:t xml:space="preserve"> ὃ οὐκ ἔστιν ἄλλο· εἰ μή τινές εἰσιν οἱ ταράσσοντες ὑμᾶς καὶ θέλοντες μεταστρέψαι τὸ εὐαγγέλιον τοῦ Χριστοῦ.</w:t>
       </w:r>
@@ -347,19 +347,19 @@
       <w:pPr/>
       <w:r>
         <w:rPr>
-          <w:lang w:val="en_US" w:bidi="en_US"/>
-        </w:rPr>
-      </w:r>
-      <w:r>
-        <w:rPr>
-          <w:vertAlign w:val="superscript"/>
-          <w:lang w:val="en_US" w:bidi="en_US"/>
+          <w:lang w:val="el_GR" w:bidi="el_GR"/>
+        </w:rPr>
+      </w:r>
+      <w:r>
+        <w:rPr>
+          <w:vertAlign w:val="superscript"/>
+          <w:lang w:val="el_GR" w:bidi="el_GR"/>
         </w:rPr>
         <w:t>8</w:t>
       </w:r>
       <w:r>
         <w:rPr>
-          <w:lang w:val="en_US" w:bidi="en_US"/>
+          <w:lang w:val="el_GR" w:bidi="el_GR"/>
         </w:rPr>
         <w:t xml:space="preserve"> ἀλλὰ καὶ ἐὰν ἡμεῖς ἢ ἄγγελος ἐξ οὐρανοῦ εὐαγγελίζηται ὑμῖν παρʼ ὃ εὐηγγελισάμεθα ὑμῖν, ἀνάθεμα ἔστω.</w:t>
       </w:r>
@@ -368,19 +368,19 @@
       <w:pPr/>
       <w:r>
         <w:rPr>
-          <w:lang w:val="en_US" w:bidi="en_US"/>
-        </w:rPr>
-      </w:r>
-      <w:r>
-        <w:rPr>
-          <w:vertAlign w:val="superscript"/>
-          <w:lang w:val="en_US" w:bidi="en_US"/>
+          <w:lang w:val="el_GR" w:bidi="el_GR"/>
+        </w:rPr>
+      </w:r>
+      <w:r>
+        <w:rPr>
+          <w:vertAlign w:val="superscript"/>
+          <w:lang w:val="el_GR" w:bidi="el_GR"/>
         </w:rPr>
         <w:t>9</w:t>
       </w:r>
       <w:r>
         <w:rPr>
-          <w:lang w:val="en_US" w:bidi="en_US"/>
+          <w:lang w:val="el_GR" w:bidi="el_GR"/>
         </w:rPr>
         <w:t xml:space="preserve"> ὡς προειρήκαμεν, καὶ ἄρτι πάλιν λέγω, εἴ τις ὑμᾶς εὐαγγελίζεται παρʼ ὃ παρελάβετε, ἀνάθεμα ἔστω.</w:t>
       </w:r>
@@ -389,19 +389,19 @@
       <w:pPr/>
       <w:r>
         <w:rPr>
-          <w:lang w:val="en_US" w:bidi="en_US"/>
-        </w:rPr>
-      </w:r>
-      <w:r>
-        <w:rPr>
-          <w:vertAlign w:val="superscript"/>
-          <w:lang w:val="en_US" w:bidi="en_US"/>
+          <w:lang w:val="el_GR" w:bidi="el_GR"/>
+        </w:rPr>
+      </w:r>
+      <w:r>
+        <w:rPr>
+          <w:vertAlign w:val="superscript"/>
+          <w:lang w:val="el_GR" w:bidi="el_GR"/>
         </w:rPr>
         <w:t>10</w:t>
       </w:r>
       <w:r>
         <w:rPr>
-          <w:lang w:val="en_US" w:bidi="en_US"/>
+          <w:lang w:val="el_GR" w:bidi="el_GR"/>
         </w:rPr>
         <w:t xml:space="preserve"> Ἄρτι γὰρ ἀνθρώπους πείθω ἢ τὸν θεόν; ἢ ζητῶ ἀνθρώποις ἀρέσκειν; εἰ ἔτι ἀνθρώποις ἤρεσκον, Χριστοῦ δοῦλος οὐκ ἂν ἤμην.</w:t>
       </w:r>
@@ -410,19 +410,19 @@
       <w:pPr/>
       <w:r>
         <w:rPr>
-          <w:lang w:val="en_US" w:bidi="en_US"/>
-        </w:rPr>
-      </w:r>
-      <w:r>
-        <w:rPr>
-          <w:vertAlign w:val="superscript"/>
-          <w:lang w:val="en_US" w:bidi="en_US"/>
+          <w:lang w:val="el_GR" w:bidi="el_GR"/>
+        </w:rPr>
+      </w:r>
+      <w:r>
+        <w:rPr>
+          <w:vertAlign w:val="superscript"/>
+          <w:lang w:val="el_GR" w:bidi="el_GR"/>
         </w:rPr>
         <w:t>11</w:t>
       </w:r>
       <w:r>
         <w:rPr>
-          <w:lang w:val="en_US" w:bidi="en_US"/>
+          <w:lang w:val="el_GR" w:bidi="el_GR"/>
         </w:rPr>
         <w:t xml:space="preserve"> Γνωρίζω γὰρ ὑμῖν, ἀδελφοί, τὸ εὐαγγέλιον τὸ εὐαγγελισθὲν ὑπʼ ἐμοῦ ὅτι οὐκ ἔστιν κατὰ ἄνθρωπον·</w:t>
       </w:r>
@@ -431,19 +431,19 @@
       <w:pPr/>
       <w:r>
         <w:rPr>
-          <w:lang w:val="en_US" w:bidi="en_US"/>
-        </w:rPr>
-      </w:r>
-      <w:r>
-        <w:rPr>
-          <w:vertAlign w:val="superscript"/>
-          <w:lang w:val="en_US" w:bidi="en_US"/>
+          <w:lang w:val="el_GR" w:bidi="el_GR"/>
+        </w:rPr>
+      </w:r>
+      <w:r>
+        <w:rPr>
+          <w:vertAlign w:val="superscript"/>
+          <w:lang w:val="el_GR" w:bidi="el_GR"/>
         </w:rPr>
         <w:t>12</w:t>
       </w:r>
       <w:r>
         <w:rPr>
-          <w:lang w:val="en_US" w:bidi="en_US"/>
+          <w:lang w:val="el_GR" w:bidi="el_GR"/>
         </w:rPr>
         <w:t xml:space="preserve"> οὐδὲ γὰρ ἐγὼ παρὰ ἀνθρώπου παρέλαβον αὐτό, οὔτε ἐδιδάχθην, ἀλλὰ διʼ ἀποκαλύψεως Ἰησοῦ Χριστοῦ.</w:t>
       </w:r>
@@ -452,19 +452,19 @@
       <w:pPr/>
       <w:r>
         <w:rPr>
-          <w:lang w:val="en_US" w:bidi="en_US"/>
-        </w:rPr>
-      </w:r>
-      <w:r>
-        <w:rPr>
-          <w:vertAlign w:val="superscript"/>
-          <w:lang w:val="en_US" w:bidi="en_US"/>
+          <w:lang w:val="el_GR" w:bidi="el_GR"/>
+        </w:rPr>
+      </w:r>
+      <w:r>
+        <w:rPr>
+          <w:vertAlign w:val="superscript"/>
+          <w:lang w:val="el_GR" w:bidi="el_GR"/>
         </w:rPr>
         <w:t>13</w:t>
       </w:r>
       <w:r>
         <w:rPr>
-          <w:lang w:val="en_US" w:bidi="en_US"/>
+          <w:lang w:val="el_GR" w:bidi="el_GR"/>
         </w:rPr>
         <w:t xml:space="preserve"> Ἠκούσατε γὰρ τὴν ἐμὴν ἀναστροφήν ποτε ἐν τῷ Ἰουδαϊσμῷ, ὅτι καθʼ ὑπερβολὴν ἐδίωκον τὴν ἐκκλησίαν τοῦ θεοῦ καὶ ἐπόρθουν αὐτήν,</w:t>
       </w:r>
@@ -473,19 +473,19 @@
       <w:pPr/>
       <w:r>
         <w:rPr>
-          <w:lang w:val="en_US" w:bidi="en_US"/>
-        </w:rPr>
-      </w:r>
-      <w:r>
-        <w:rPr>
-          <w:vertAlign w:val="superscript"/>
-          <w:lang w:val="en_US" w:bidi="en_US"/>
+          <w:lang w:val="el_GR" w:bidi="el_GR"/>
+        </w:rPr>
+      </w:r>
+      <w:r>
+        <w:rPr>
+          <w:vertAlign w:val="superscript"/>
+          <w:lang w:val="el_GR" w:bidi="el_GR"/>
         </w:rPr>
         <w:t>14</w:t>
       </w:r>
       <w:r>
         <w:rPr>
-          <w:lang w:val="en_US" w:bidi="en_US"/>
+          <w:lang w:val="el_GR" w:bidi="el_GR"/>
         </w:rPr>
         <w:t xml:space="preserve"> καὶ προέκοπτον ἐν τῷ Ἰουδαϊσμῷ ὑπὲρ πολλοὺς συνηλικιώτας ἐν τῷ γένει μου, περισσοτέρως ζηλωτὴς ὑπάρχων τῶν πατρικῶν μου παραδόσεων.</w:t>
       </w:r>
@@ -494,19 +494,19 @@
       <w:pPr/>
       <w:r>
         <w:rPr>
-          <w:lang w:val="en_US" w:bidi="en_US"/>
-        </w:rPr>
-      </w:r>
-      <w:r>
-        <w:rPr>
-          <w:vertAlign w:val="superscript"/>
-          <w:lang w:val="en_US" w:bidi="en_US"/>
+          <w:lang w:val="el_GR" w:bidi="el_GR"/>
+        </w:rPr>
+      </w:r>
+      <w:r>
+        <w:rPr>
+          <w:vertAlign w:val="superscript"/>
+          <w:lang w:val="el_GR" w:bidi="el_GR"/>
         </w:rPr>
         <w:t>15</w:t>
       </w:r>
       <w:r>
         <w:rPr>
-          <w:lang w:val="en_US" w:bidi="en_US"/>
+          <w:lang w:val="el_GR" w:bidi="el_GR"/>
         </w:rPr>
         <w:t xml:space="preserve"> ὅτε δὲ εὐδόκησεν ὁ ἀφορίσας με ἐκ κοιλίας μητρός μου καὶ καλέσας διὰ τῆς χάριτος αὐτοῦ</w:t>
       </w:r>
@@ -515,19 +515,19 @@
       <w:pPr/>
       <w:r>
         <w:rPr>
-          <w:lang w:val="en_US" w:bidi="en_US"/>
-        </w:rPr>
-      </w:r>
-      <w:r>
-        <w:rPr>
-          <w:vertAlign w:val="superscript"/>
-          <w:lang w:val="en_US" w:bidi="en_US"/>
+          <w:lang w:val="el_GR" w:bidi="el_GR"/>
+        </w:rPr>
+      </w:r>
+      <w:r>
+        <w:rPr>
+          <w:vertAlign w:val="superscript"/>
+          <w:lang w:val="el_GR" w:bidi="el_GR"/>
         </w:rPr>
         <w:t>16</w:t>
       </w:r>
       <w:r>
         <w:rPr>
-          <w:lang w:val="en_US" w:bidi="en_US"/>
+          <w:lang w:val="el_GR" w:bidi="el_GR"/>
         </w:rPr>
         <w:t xml:space="preserve"> ἀποκαλύψαι τὸν υἱὸν αὐτοῦ ἐν ἐμοὶ ἵνα εὐαγγελίζωμαι αὐτὸν ἐν τοῖς ἔθνεσιν, εὐθέως οὐ προσανεθέμην σαρκὶ καὶ αἵματι,</w:t>
       </w:r>
@@ -536,19 +536,19 @@
       <w:pPr/>
       <w:r>
         <w:rPr>
-          <w:lang w:val="en_US" w:bidi="en_US"/>
-        </w:rPr>
-      </w:r>
-      <w:r>
-        <w:rPr>
-          <w:vertAlign w:val="superscript"/>
-          <w:lang w:val="en_US" w:bidi="en_US"/>
+          <w:lang w:val="el_GR" w:bidi="el_GR"/>
+        </w:rPr>
+      </w:r>
+      <w:r>
+        <w:rPr>
+          <w:vertAlign w:val="superscript"/>
+          <w:lang w:val="el_GR" w:bidi="el_GR"/>
         </w:rPr>
         <w:t>17</w:t>
       </w:r>
       <w:r>
         <w:rPr>
-          <w:lang w:val="en_US" w:bidi="en_US"/>
+          <w:lang w:val="el_GR" w:bidi="el_GR"/>
         </w:rPr>
         <w:t xml:space="preserve"> οὐδὲ ἀνῆλθον εἰς Ἱεροσόλυμα πρὸς τοὺς πρὸ ἐμοῦ ἀποστόλους, ἀλλὰ ἀπῆλθον εἰς Ἀραβίαν, καὶ πάλιν ὑπέστρεψα εἰς Δαμασκόν.</w:t>
       </w:r>
@@ -557,19 +557,19 @@
       <w:pPr/>
       <w:r>
         <w:rPr>
-          <w:lang w:val="en_US" w:bidi="en_US"/>
-        </w:rPr>
-      </w:r>
-      <w:r>
-        <w:rPr>
-          <w:vertAlign w:val="superscript"/>
-          <w:lang w:val="en_US" w:bidi="en_US"/>
+          <w:lang w:val="el_GR" w:bidi="el_GR"/>
+        </w:rPr>
+      </w:r>
+      <w:r>
+        <w:rPr>
+          <w:vertAlign w:val="superscript"/>
+          <w:lang w:val="el_GR" w:bidi="el_GR"/>
         </w:rPr>
         <w:t>18</w:t>
       </w:r>
       <w:r>
         <w:rPr>
-          <w:lang w:val="en_US" w:bidi="en_US"/>
+          <w:lang w:val="el_GR" w:bidi="el_GR"/>
         </w:rPr>
         <w:t xml:space="preserve"> Ἔπειτα μετὰ ἔτη τρία ἀνῆλθον εἰς Ἱεροσόλυμα ἱστορῆσαι Κηφᾶν, καὶ ἐπέμεινα πρὸς αὐτὸν ἡμέρας δεκαπέντε·</w:t>
       </w:r>
@@ -578,19 +578,19 @@
       <w:pPr/>
       <w:r>
         <w:rPr>
-          <w:lang w:val="en_US" w:bidi="en_US"/>
-        </w:rPr>
-      </w:r>
-      <w:r>
-        <w:rPr>
-          <w:vertAlign w:val="superscript"/>
-          <w:lang w:val="en_US" w:bidi="en_US"/>
+          <w:lang w:val="el_GR" w:bidi="el_GR"/>
+        </w:rPr>
+      </w:r>
+      <w:r>
+        <w:rPr>
+          <w:vertAlign w:val="superscript"/>
+          <w:lang w:val="el_GR" w:bidi="el_GR"/>
         </w:rPr>
         <w:t>19</w:t>
       </w:r>
       <w:r>
         <w:rPr>
-          <w:lang w:val="en_US" w:bidi="en_US"/>
+          <w:lang w:val="el_GR" w:bidi="el_GR"/>
         </w:rPr>
         <w:t xml:space="preserve"> ἕτερον δὲ τῶν ἀποστόλων οὐκ εἶδον, εἰ μὴ Ἰάκωβον τὸν ἀδελφὸν τοῦ κυρίου.</w:t>
       </w:r>
@@ -599,19 +599,19 @@
       <w:pPr/>
       <w:r>
         <w:rPr>
-          <w:lang w:val="en_US" w:bidi="en_US"/>
-        </w:rPr>
-      </w:r>
-      <w:r>
-        <w:rPr>
-          <w:vertAlign w:val="superscript"/>
-          <w:lang w:val="en_US" w:bidi="en_US"/>
+          <w:lang w:val="el_GR" w:bidi="el_GR"/>
+        </w:rPr>
+      </w:r>
+      <w:r>
+        <w:rPr>
+          <w:vertAlign w:val="superscript"/>
+          <w:lang w:val="el_GR" w:bidi="el_GR"/>
         </w:rPr>
         <w:t>20</w:t>
       </w:r>
       <w:r>
         <w:rPr>
-          <w:lang w:val="en_US" w:bidi="en_US"/>
+          <w:lang w:val="el_GR" w:bidi="el_GR"/>
         </w:rPr>
         <w:t xml:space="preserve"> ἃ δὲ γράφω ὑμῖν, ἰδοὺ ἐνώπιον τοῦ θεοῦ ὅτι οὐ ψεύδομαι.</w:t>
       </w:r>
@@ -620,19 +620,19 @@
       <w:pPr/>
       <w:r>
         <w:rPr>
-          <w:lang w:val="en_US" w:bidi="en_US"/>
-        </w:rPr>
-      </w:r>
-      <w:r>
-        <w:rPr>
-          <w:vertAlign w:val="superscript"/>
-          <w:lang w:val="en_US" w:bidi="en_US"/>
+          <w:lang w:val="el_GR" w:bidi="el_GR"/>
+        </w:rPr>
+      </w:r>
+      <w:r>
+        <w:rPr>
+          <w:vertAlign w:val="superscript"/>
+          <w:lang w:val="el_GR" w:bidi="el_GR"/>
         </w:rPr>
         <w:t>21</w:t>
       </w:r>
       <w:r>
         <w:rPr>
-          <w:lang w:val="en_US" w:bidi="en_US"/>
+          <w:lang w:val="el_GR" w:bidi="el_GR"/>
         </w:rPr>
         <w:t xml:space="preserve"> ἔπειτα ἦλθον εἰς τὰ κλίματα τῆς Συρίας καὶ τῆς Κιλικίας.</w:t>
       </w:r>
@@ -641,19 +641,19 @@
       <w:pPr/>
       <w:r>
         <w:rPr>
-          <w:lang w:val="en_US" w:bidi="en_US"/>
-        </w:rPr>
-      </w:r>
-      <w:r>
-        <w:rPr>
-          <w:vertAlign w:val="superscript"/>
-          <w:lang w:val="en_US" w:bidi="en_US"/>
+          <w:lang w:val="el_GR" w:bidi="el_GR"/>
+        </w:rPr>
+      </w:r>
+      <w:r>
+        <w:rPr>
+          <w:vertAlign w:val="superscript"/>
+          <w:lang w:val="el_GR" w:bidi="el_GR"/>
         </w:rPr>
         <w:t>22</w:t>
       </w:r>
       <w:r>
         <w:rPr>
-          <w:lang w:val="en_US" w:bidi="en_US"/>
+          <w:lang w:val="el_GR" w:bidi="el_GR"/>
         </w:rPr>
         <w:t xml:space="preserve"> ἤμην δὲ ἀγνοούμενος τῷ προσώπῳ ταῖς ἐκκλησίαις τῆς Ἰουδαίας ταῖς ἐν Χριστῷ,</w:t>
       </w:r>
@@ -662,19 +662,19 @@
       <w:pPr/>
       <w:r>
         <w:rPr>
-          <w:lang w:val="en_US" w:bidi="en_US"/>
-        </w:rPr>
-      </w:r>
-      <w:r>
-        <w:rPr>
-          <w:vertAlign w:val="superscript"/>
-          <w:lang w:val="en_US" w:bidi="en_US"/>
+          <w:lang w:val="el_GR" w:bidi="el_GR"/>
+        </w:rPr>
+      </w:r>
+      <w:r>
+        <w:rPr>
+          <w:vertAlign w:val="superscript"/>
+          <w:lang w:val="el_GR" w:bidi="el_GR"/>
         </w:rPr>
         <w:t>23</w:t>
       </w:r>
       <w:r>
         <w:rPr>
-          <w:lang w:val="en_US" w:bidi="en_US"/>
+          <w:lang w:val="el_GR" w:bidi="el_GR"/>
         </w:rPr>
         <w:t xml:space="preserve"> μόνον δὲ ἀκούοντες ἦσαν ὅτι Ὁ διώκων ἡμᾶς ποτε νῦν εὐαγγελίζεται τὴν πίστιν ἥν ποτε ἐπόρθει,</w:t>
       </w:r>
@@ -683,19 +683,19 @@
       <w:pPr/>
       <w:r>
         <w:rPr>
-          <w:lang w:val="en_US" w:bidi="en_US"/>
-        </w:rPr>
-      </w:r>
-      <w:r>
-        <w:rPr>
-          <w:vertAlign w:val="superscript"/>
-          <w:lang w:val="en_US" w:bidi="en_US"/>
+          <w:lang w:val="el_GR" w:bidi="el_GR"/>
+        </w:rPr>
+      </w:r>
+      <w:r>
+        <w:rPr>
+          <w:vertAlign w:val="superscript"/>
+          <w:lang w:val="el_GR" w:bidi="el_GR"/>
         </w:rPr>
         <w:t>24</w:t>
       </w:r>
       <w:r>
         <w:rPr>
-          <w:lang w:val="en_US" w:bidi="en_US"/>
+          <w:lang w:val="el_GR" w:bidi="el_GR"/>
         </w:rPr>
         <w:t xml:space="preserve"> καὶ ἐδόξαζον ἐν ἐμοὶ τὸν θεόν.</w:t>
       </w:r>
@@ -706,33 +706,33 @@
       </w:pPr>
       <w:r>
         <w:rPr>
-          <w:lang w:val="en_US" w:bidi="en_US"/>
+          <w:lang w:val="el_GR" w:bidi="el_GR"/>
         </w:rPr>
         <w:t>Galatians 2:1</w:t>
       </w:r>
       <w:r>
         <w:rPr>
-          <w:lang w:val="en_US" w:bidi="en_US"/>
-        </w:rPr>
-      </w:r>
-    </w:p>
-    <w:p>
-      <w:pPr/>
-      <w:r>
-        <w:rPr>
-          <w:lang w:val="en_US" w:bidi="en_US"/>
-        </w:rPr>
-      </w:r>
-      <w:r>
-        <w:rPr>
-          <w:vertAlign w:val="superscript"/>
-          <w:lang w:val="en_US" w:bidi="en_US"/>
+          <w:lang w:val="el_GR" w:bidi="el_GR"/>
+        </w:rPr>
+      </w:r>
+    </w:p>
+    <w:p>
+      <w:pPr/>
+      <w:r>
+        <w:rPr>
+          <w:lang w:val="el_GR" w:bidi="el_GR"/>
+        </w:rPr>
+      </w:r>
+      <w:r>
+        <w:rPr>
+          <w:vertAlign w:val="superscript"/>
+          <w:lang w:val="el_GR" w:bidi="el_GR"/>
         </w:rPr>
         <w:t>1</w:t>
       </w:r>
       <w:r>
         <w:rPr>
-          <w:lang w:val="en_US" w:bidi="en_US"/>
+          <w:lang w:val="el_GR" w:bidi="el_GR"/>
         </w:rPr>
         <w:t xml:space="preserve"> Ἔπειτα διὰ δεκατεσσάρων ἐτῶν πάλιν ἀνέβην εἰς Ἱεροσόλυμα μετὰ Βαρναβᾶ συμπαραλαβὼν καὶ Τίτον·</w:t>
       </w:r>
@@ -741,19 +741,19 @@
       <w:pPr/>
       <w:r>
         <w:rPr>
-          <w:lang w:val="en_US" w:bidi="en_US"/>
-        </w:rPr>
-      </w:r>
-      <w:r>
-        <w:rPr>
-          <w:vertAlign w:val="superscript"/>
-          <w:lang w:val="en_US" w:bidi="en_US"/>
+          <w:lang w:val="el_GR" w:bidi="el_GR"/>
+        </w:rPr>
+      </w:r>
+      <w:r>
+        <w:rPr>
+          <w:vertAlign w:val="superscript"/>
+          <w:lang w:val="el_GR" w:bidi="el_GR"/>
         </w:rPr>
         <w:t>2</w:t>
       </w:r>
       <w:r>
         <w:rPr>
-          <w:lang w:val="en_US" w:bidi="en_US"/>
+          <w:lang w:val="el_GR" w:bidi="el_GR"/>
         </w:rPr>
         <w:t xml:space="preserve"> ἀνέβην δὲ κατὰ ἀποκάλυψιν· καὶ ἀνεθέμην αὐτοῖς τὸ εὐαγγέλιον ὃ κηρύσσω ἐν τοῖς ἔθνεσιν, κατʼ ἰδίαν δὲ τοῖς δοκοῦσιν, μή πως εἰς κενὸν τρέχω ἢ ἔδραμον.</w:t>
       </w:r>
@@ -762,19 +762,19 @@
       <w:pPr/>
       <w:r>
         <w:rPr>
-          <w:lang w:val="en_US" w:bidi="en_US"/>
-        </w:rPr>
-      </w:r>
-      <w:r>
-        <w:rPr>
-          <w:vertAlign w:val="superscript"/>
-          <w:lang w:val="en_US" w:bidi="en_US"/>
+          <w:lang w:val="el_GR" w:bidi="el_GR"/>
+        </w:rPr>
+      </w:r>
+      <w:r>
+        <w:rPr>
+          <w:vertAlign w:val="superscript"/>
+          <w:lang w:val="el_GR" w:bidi="el_GR"/>
         </w:rPr>
         <w:t>3</w:t>
       </w:r>
       <w:r>
         <w:rPr>
-          <w:lang w:val="en_US" w:bidi="en_US"/>
+          <w:lang w:val="el_GR" w:bidi="el_GR"/>
         </w:rPr>
         <w:t xml:space="preserve"> ἀλλʼ οὐδὲ Τίτος ὁ σὺν ἐμοί, Ἕλλην ὤν, ἠναγκάσθη περιτμηθῆναι·</w:t>
       </w:r>
@@ -783,19 +783,19 @@
       <w:pPr/>
       <w:r>
         <w:rPr>
-          <w:lang w:val="en_US" w:bidi="en_US"/>
-        </w:rPr>
-      </w:r>
-      <w:r>
-        <w:rPr>
-          <w:vertAlign w:val="superscript"/>
-          <w:lang w:val="en_US" w:bidi="en_US"/>
+          <w:lang w:val="el_GR" w:bidi="el_GR"/>
+        </w:rPr>
+      </w:r>
+      <w:r>
+        <w:rPr>
+          <w:vertAlign w:val="superscript"/>
+          <w:lang w:val="el_GR" w:bidi="el_GR"/>
         </w:rPr>
         <w:t>4</w:t>
       </w:r>
       <w:r>
         <w:rPr>
-          <w:lang w:val="en_US" w:bidi="en_US"/>
+          <w:lang w:val="el_GR" w:bidi="el_GR"/>
         </w:rPr>
         <w:t xml:space="preserve"> διὰ δὲ τοὺς παρεισάκτους ψευδαδέλφους, οἵτινες παρεισῆλθον κατασκοπῆσαι τὴν ἐλευθερίαν ἡμῶν ἣν ἔχομεν ἐν Χριστῷ Ἰησοῦ, ἵνα ἡμᾶς καταδουλώσουσιν—</w:t>
       </w:r>
@@ -804,19 +804,19 @@
       <w:pPr/>
       <w:r>
         <w:rPr>
-          <w:lang w:val="en_US" w:bidi="en_US"/>
-        </w:rPr>
-      </w:r>
-      <w:r>
-        <w:rPr>
-          <w:vertAlign w:val="superscript"/>
-          <w:lang w:val="en_US" w:bidi="en_US"/>
+          <w:lang w:val="el_GR" w:bidi="el_GR"/>
+        </w:rPr>
+      </w:r>
+      <w:r>
+        <w:rPr>
+          <w:vertAlign w:val="superscript"/>
+          <w:lang w:val="el_GR" w:bidi="el_GR"/>
         </w:rPr>
         <w:t>5</w:t>
       </w:r>
       <w:r>
         <w:rPr>
-          <w:lang w:val="en_US" w:bidi="en_US"/>
+          <w:lang w:val="el_GR" w:bidi="el_GR"/>
         </w:rPr>
         <w:t xml:space="preserve"> οἷς οὐδὲ πρὸς ὥραν εἴξαμεν τῇ ὑποταγῇ, ἵνα ἡ ἀλήθεια τοῦ εὐαγγελίου διαμείνῃ πρὸς ὑμᾶς.</w:t>
       </w:r>
@@ -825,19 +825,19 @@
       <w:pPr/>
       <w:r>
         <w:rPr>
-          <w:lang w:val="en_US" w:bidi="en_US"/>
-        </w:rPr>
-      </w:r>
-      <w:r>
-        <w:rPr>
-          <w:vertAlign w:val="superscript"/>
-          <w:lang w:val="en_US" w:bidi="en_US"/>
+          <w:lang w:val="el_GR" w:bidi="el_GR"/>
+        </w:rPr>
+      </w:r>
+      <w:r>
+        <w:rPr>
+          <w:vertAlign w:val="superscript"/>
+          <w:lang w:val="el_GR" w:bidi="el_GR"/>
         </w:rPr>
         <w:t>6</w:t>
       </w:r>
       <w:r>
         <w:rPr>
-          <w:lang w:val="en_US" w:bidi="en_US"/>
+          <w:lang w:val="el_GR" w:bidi="el_GR"/>
         </w:rPr>
         <w:t xml:space="preserve"> ἀπὸ δὲ τῶν δοκούντων εἶναί τι—ὁποῖοί ποτε ἦσαν οὐδέν μοι διαφέρει· πρόσωπον θεὸς ἀνθρώπου οὐ λαμβάνει—ἐμοὶ γὰρ οἱ δοκοῦντες οὐδὲν προσανέθεντο,</w:t>
       </w:r>
@@ -846,19 +846,19 @@
       <w:pPr/>
       <w:r>
         <w:rPr>
-          <w:lang w:val="en_US" w:bidi="en_US"/>
-        </w:rPr>
-      </w:r>
-      <w:r>
-        <w:rPr>
-          <w:vertAlign w:val="superscript"/>
-          <w:lang w:val="en_US" w:bidi="en_US"/>
+          <w:lang w:val="el_GR" w:bidi="el_GR"/>
+        </w:rPr>
+      </w:r>
+      <w:r>
+        <w:rPr>
+          <w:vertAlign w:val="superscript"/>
+          <w:lang w:val="el_GR" w:bidi="el_GR"/>
         </w:rPr>
         <w:t>7</w:t>
       </w:r>
       <w:r>
         <w:rPr>
-          <w:lang w:val="en_US" w:bidi="en_US"/>
+          <w:lang w:val="el_GR" w:bidi="el_GR"/>
         </w:rPr>
         <w:t xml:space="preserve"> ἀλλὰ τοὐναντίον ἰδόντες ὅτι πεπίστευμαι τὸ εὐαγγέλιον τῆς ἀκροβυστίας καθὼς Πέτρος τῆς περιτομῆς,</w:t>
       </w:r>
@@ -867,19 +867,19 @@
       <w:pPr/>
       <w:r>
         <w:rPr>
-          <w:lang w:val="en_US" w:bidi="en_US"/>
-        </w:rPr>
-      </w:r>
-      <w:r>
-        <w:rPr>
-          <w:vertAlign w:val="superscript"/>
-          <w:lang w:val="en_US" w:bidi="en_US"/>
+          <w:lang w:val="el_GR" w:bidi="el_GR"/>
+        </w:rPr>
+      </w:r>
+      <w:r>
+        <w:rPr>
+          <w:vertAlign w:val="superscript"/>
+          <w:lang w:val="el_GR" w:bidi="el_GR"/>
         </w:rPr>
         <w:t>8</w:t>
       </w:r>
       <w:r>
         <w:rPr>
-          <w:lang w:val="en_US" w:bidi="en_US"/>
+          <w:lang w:val="el_GR" w:bidi="el_GR"/>
         </w:rPr>
         <w:t xml:space="preserve"> ὁ γὰρ ἐνεργήσας Πέτρῳ εἰς ἀποστολὴν τῆς περιτομῆς ἐνήργησεν καὶ ἐμοὶ εἰς τὰ ἔθνη,</w:t>
       </w:r>
@@ -888,19 +888,19 @@
       <w:pPr/>
       <w:r>
         <w:rPr>
-          <w:lang w:val="en_US" w:bidi="en_US"/>
-        </w:rPr>
-      </w:r>
-      <w:r>
-        <w:rPr>
-          <w:vertAlign w:val="superscript"/>
-          <w:lang w:val="en_US" w:bidi="en_US"/>
+          <w:lang w:val="el_GR" w:bidi="el_GR"/>
+        </w:rPr>
+      </w:r>
+      <w:r>
+        <w:rPr>
+          <w:vertAlign w:val="superscript"/>
+          <w:lang w:val="el_GR" w:bidi="el_GR"/>
         </w:rPr>
         <w:t>9</w:t>
       </w:r>
       <w:r>
         <w:rPr>
-          <w:lang w:val="en_US" w:bidi="en_US"/>
+          <w:lang w:val="el_GR" w:bidi="el_GR"/>
         </w:rPr>
         <w:t xml:space="preserve"> καὶ γνόντες τὴν χάριν τὴν δοθεῖσάν μοι, Ἰάκωβος καὶ Κηφᾶς καὶ Ἰωάννης, οἱ δοκοῦντες στῦλοι εἶναι, δεξιὰς ἔδωκαν ἐμοὶ καὶ Βαρναβᾷ κοινωνίας, ἵνα ἡμεῖς εἰς τὰ ἔθνη, αὐτοὶ δὲ εἰς τὴν περιτομήν·</w:t>
       </w:r>
@@ -909,19 +909,19 @@
       <w:pPr/>
       <w:r>
         <w:rPr>
-          <w:lang w:val="en_US" w:bidi="en_US"/>
-        </w:rPr>
-      </w:r>
-      <w:r>
-        <w:rPr>
-          <w:vertAlign w:val="superscript"/>
-          <w:lang w:val="en_US" w:bidi="en_US"/>
+          <w:lang w:val="el_GR" w:bidi="el_GR"/>
+        </w:rPr>
+      </w:r>
+      <w:r>
+        <w:rPr>
+          <w:vertAlign w:val="superscript"/>
+          <w:lang w:val="el_GR" w:bidi="el_GR"/>
         </w:rPr>
         <w:t>10</w:t>
       </w:r>
       <w:r>
         <w:rPr>
-          <w:lang w:val="en_US" w:bidi="en_US"/>
+          <w:lang w:val="el_GR" w:bidi="el_GR"/>
         </w:rPr>
         <w:t xml:space="preserve"> μόνον τῶν πτωχῶν ἵνα μνημονεύωμεν, ὃ καὶ ἐσπούδασα αὐτὸ τοῦτο ποιῆσαι.</w:t>
       </w:r>
@@ -930,19 +930,19 @@
       <w:pPr/>
       <w:r>
         <w:rPr>
-          <w:lang w:val="en_US" w:bidi="en_US"/>
-        </w:rPr>
-      </w:r>
-      <w:r>
-        <w:rPr>
-          <w:vertAlign w:val="superscript"/>
-          <w:lang w:val="en_US" w:bidi="en_US"/>
+          <w:lang w:val="el_GR" w:bidi="el_GR"/>
+        </w:rPr>
+      </w:r>
+      <w:r>
+        <w:rPr>
+          <w:vertAlign w:val="superscript"/>
+          <w:lang w:val="el_GR" w:bidi="el_GR"/>
         </w:rPr>
         <w:t>11</w:t>
       </w:r>
       <w:r>
         <w:rPr>
-          <w:lang w:val="en_US" w:bidi="en_US"/>
+          <w:lang w:val="el_GR" w:bidi="el_GR"/>
         </w:rPr>
         <w:t xml:space="preserve"> Ὅτε δὲ ἦλθεν Κηφᾶς εἰς Ἀντιόχειαν, κατὰ πρόσωπον αὐτῷ ἀντέστην, ὅτι κατεγνωσμένος ἦν·</w:t>
       </w:r>
@@ -951,19 +951,19 @@
       <w:pPr/>
       <w:r>
         <w:rPr>
-          <w:lang w:val="en_US" w:bidi="en_US"/>
-        </w:rPr>
-      </w:r>
-      <w:r>
-        <w:rPr>
-          <w:vertAlign w:val="superscript"/>
-          <w:lang w:val="en_US" w:bidi="en_US"/>
+          <w:lang w:val="el_GR" w:bidi="el_GR"/>
+        </w:rPr>
+      </w:r>
+      <w:r>
+        <w:rPr>
+          <w:vertAlign w:val="superscript"/>
+          <w:lang w:val="el_GR" w:bidi="el_GR"/>
         </w:rPr>
         <w:t>12</w:t>
       </w:r>
       <w:r>
         <w:rPr>
-          <w:lang w:val="en_US" w:bidi="en_US"/>
+          <w:lang w:val="el_GR" w:bidi="el_GR"/>
         </w:rPr>
         <w:t xml:space="preserve"> πρὸ τοῦ γὰρ ἐλθεῖν τινας ἀπὸ Ἰακώβου μετὰ τῶν ἐθνῶν συνήσθιεν· ὅτε δὲ ἦλθον, ὑπέστελλεν καὶ ἀφώριζεν ἑαυτόν, φοβούμενος τοὺς ἐκ περιτομῆς.</w:t>
       </w:r>
@@ -972,19 +972,19 @@
       <w:pPr/>
       <w:r>
         <w:rPr>
-          <w:lang w:val="en_US" w:bidi="en_US"/>
-        </w:rPr>
-      </w:r>
-      <w:r>
-        <w:rPr>
-          <w:vertAlign w:val="superscript"/>
-          <w:lang w:val="en_US" w:bidi="en_US"/>
+          <w:lang w:val="el_GR" w:bidi="el_GR"/>
+        </w:rPr>
+      </w:r>
+      <w:r>
+        <w:rPr>
+          <w:vertAlign w:val="superscript"/>
+          <w:lang w:val="el_GR" w:bidi="el_GR"/>
         </w:rPr>
         <w:t>13</w:t>
       </w:r>
       <w:r>
         <w:rPr>
-          <w:lang w:val="en_US" w:bidi="en_US"/>
+          <w:lang w:val="el_GR" w:bidi="el_GR"/>
         </w:rPr>
         <w:t xml:space="preserve"> καὶ συνυπεκρίθησαν αὐτῷ καὶ οἱ λοιποὶ Ἰουδαῖοι, ὥστε καὶ Βαρναβᾶς συναπήχθη αὐτῶν τῇ ὑποκρίσει.</w:t>
       </w:r>
@@ -993,19 +993,19 @@
       <w:pPr/>
       <w:r>
         <w:rPr>
-          <w:lang w:val="en_US" w:bidi="en_US"/>
-        </w:rPr>
-      </w:r>
-      <w:r>
-        <w:rPr>
-          <w:vertAlign w:val="superscript"/>
-          <w:lang w:val="en_US" w:bidi="en_US"/>
+          <w:lang w:val="el_GR" w:bidi="el_GR"/>
+        </w:rPr>
+      </w:r>
+      <w:r>
+        <w:rPr>
+          <w:vertAlign w:val="superscript"/>
+          <w:lang w:val="el_GR" w:bidi="el_GR"/>
         </w:rPr>
         <w:t>14</w:t>
       </w:r>
       <w:r>
         <w:rPr>
-          <w:lang w:val="en_US" w:bidi="en_US"/>
+          <w:lang w:val="el_GR" w:bidi="el_GR"/>
         </w:rPr>
         <w:t xml:space="preserve"> ἀλλʼ ὅτε εἶδον ὅτι οὐκ ὀρθοποδοῦσιν πρὸς τὴν ἀλήθειαν τοῦ εὐαγγελίου, εἶπον τῷ Κηφᾷ ἔμπροσθεν πάντων· Εἰ σὺ Ἰουδαῖος ὑπάρχων ἐθνικῶς καὶ οὐκ Ἰουδαϊκῶς ζῇς, πῶς τὰ ἔθνη ἀναγκάζεις Ἰουδαΐζειν;</w:t>
       </w:r>
@@ -1014,19 +1014,19 @@
       <w:pPr/>
       <w:r>
         <w:rPr>
-          <w:lang w:val="en_US" w:bidi="en_US"/>
-        </w:rPr>
-      </w:r>
-      <w:r>
-        <w:rPr>
-          <w:vertAlign w:val="superscript"/>
-          <w:lang w:val="en_US" w:bidi="en_US"/>
+          <w:lang w:val="el_GR" w:bidi="el_GR"/>
+        </w:rPr>
+      </w:r>
+      <w:r>
+        <w:rPr>
+          <w:vertAlign w:val="superscript"/>
+          <w:lang w:val="el_GR" w:bidi="el_GR"/>
         </w:rPr>
         <w:t>15</w:t>
       </w:r>
       <w:r>
         <w:rPr>
-          <w:lang w:val="en_US" w:bidi="en_US"/>
+          <w:lang w:val="el_GR" w:bidi="el_GR"/>
         </w:rPr>
         <w:t xml:space="preserve"> Ἡμεῖς φύσει Ἰουδαῖοι καὶ οὐκ ἐξ ἐθνῶν ἁμαρτωλοί,</w:t>
       </w:r>
@@ -1035,19 +1035,19 @@
       <w:pPr/>
       <w:r>
         <w:rPr>
-          <w:lang w:val="en_US" w:bidi="en_US"/>
-        </w:rPr>
-      </w:r>
-      <w:r>
-        <w:rPr>
-          <w:vertAlign w:val="superscript"/>
-          <w:lang w:val="en_US" w:bidi="en_US"/>
+          <w:lang w:val="el_GR" w:bidi="el_GR"/>
+        </w:rPr>
+      </w:r>
+      <w:r>
+        <w:rPr>
+          <w:vertAlign w:val="superscript"/>
+          <w:lang w:val="el_GR" w:bidi="el_GR"/>
         </w:rPr>
         <w:t>16</w:t>
       </w:r>
       <w:r>
         <w:rPr>
-          <w:lang w:val="en_US" w:bidi="en_US"/>
+          <w:lang w:val="el_GR" w:bidi="el_GR"/>
         </w:rPr>
         <w:t xml:space="preserve"> εἰδότες δὲ ὅτι οὐ δικαιοῦται ἄνθρωπος ἐξ ἔργων νόμου ἐὰν μὴ διὰ πίστεως Ἰησοῦ Χριστοῦ, καὶ ἡμεῖς εἰς Χριστὸν Ἰησοῦν ἐπιστεύσαμεν, ἵνα δικαιωθῶμεν ἐκ πίστεως Χριστοῦ καὶ οὐκ ἐξ ἔργων νόμου, ὅτι ἐξ ἔργων νόμου οὐ δικαιωθήσεται πᾶσα σάρξ.</w:t>
       </w:r>
@@ -1056,19 +1056,19 @@
       <w:pPr/>
       <w:r>
         <w:rPr>
-          <w:lang w:val="en_US" w:bidi="en_US"/>
-        </w:rPr>
-      </w:r>
-      <w:r>
-        <w:rPr>
-          <w:vertAlign w:val="superscript"/>
-          <w:lang w:val="en_US" w:bidi="en_US"/>
+          <w:lang w:val="el_GR" w:bidi="el_GR"/>
+        </w:rPr>
+      </w:r>
+      <w:r>
+        <w:rPr>
+          <w:vertAlign w:val="superscript"/>
+          <w:lang w:val="el_GR" w:bidi="el_GR"/>
         </w:rPr>
         <w:t>17</w:t>
       </w:r>
       <w:r>
         <w:rPr>
-          <w:lang w:val="en_US" w:bidi="en_US"/>
+          <w:lang w:val="el_GR" w:bidi="el_GR"/>
         </w:rPr>
         <w:t xml:space="preserve"> εἰ δὲ ζητοῦντες δικαιωθῆναι ἐν Χριστῷ εὑρέθημεν καὶ αὐτοὶ ἁμαρτωλοί, ἆρα Χριστὸς ἁμαρτίας διάκονος; μὴ γένοιτο·</w:t>
       </w:r>
@@ -1077,19 +1077,19 @@
       <w:pPr/>
       <w:r>
         <w:rPr>
-          <w:lang w:val="en_US" w:bidi="en_US"/>
-        </w:rPr>
-      </w:r>
-      <w:r>
-        <w:rPr>
-          <w:vertAlign w:val="superscript"/>
-          <w:lang w:val="en_US" w:bidi="en_US"/>
+          <w:lang w:val="el_GR" w:bidi="el_GR"/>
+        </w:rPr>
+      </w:r>
+      <w:r>
+        <w:rPr>
+          <w:vertAlign w:val="superscript"/>
+          <w:lang w:val="el_GR" w:bidi="el_GR"/>
         </w:rPr>
         <w:t>18</w:t>
       </w:r>
       <w:r>
         <w:rPr>
-          <w:lang w:val="en_US" w:bidi="en_US"/>
+          <w:lang w:val="el_GR" w:bidi="el_GR"/>
         </w:rPr>
         <w:t xml:space="preserve"> εἰ γὰρ ἃ κατέλυσα ταῦτα πάλιν οἰκοδομῶ, παραβάτην ἐμαυτὸν συνιστάνω.</w:t>
       </w:r>
@@ -1098,19 +1098,19 @@
       <w:pPr/>
       <w:r>
         <w:rPr>
-          <w:lang w:val="en_US" w:bidi="en_US"/>
-        </w:rPr>
-      </w:r>
-      <w:r>
-        <w:rPr>
-          <w:vertAlign w:val="superscript"/>
-          <w:lang w:val="en_US" w:bidi="en_US"/>
+          <w:lang w:val="el_GR" w:bidi="el_GR"/>
+        </w:rPr>
+      </w:r>
+      <w:r>
+        <w:rPr>
+          <w:vertAlign w:val="superscript"/>
+          <w:lang w:val="el_GR" w:bidi="el_GR"/>
         </w:rPr>
         <w:t>19</w:t>
       </w:r>
       <w:r>
         <w:rPr>
-          <w:lang w:val="en_US" w:bidi="en_US"/>
+          <w:lang w:val="el_GR" w:bidi="el_GR"/>
         </w:rPr>
         <w:t xml:space="preserve"> ἐγὼ γὰρ διὰ νόμου νόμῳ ἀπέθανον ἵνα θεῷ ζήσω· Χριστῷ συνεσταύρωμαι·</w:t>
       </w:r>
@@ -1119,19 +1119,19 @@
       <w:pPr/>
       <w:r>
         <w:rPr>
-          <w:lang w:val="en_US" w:bidi="en_US"/>
-        </w:rPr>
-      </w:r>
-      <w:r>
-        <w:rPr>
-          <w:vertAlign w:val="superscript"/>
-          <w:lang w:val="en_US" w:bidi="en_US"/>
+          <w:lang w:val="el_GR" w:bidi="el_GR"/>
+        </w:rPr>
+      </w:r>
+      <w:r>
+        <w:rPr>
+          <w:vertAlign w:val="superscript"/>
+          <w:lang w:val="el_GR" w:bidi="el_GR"/>
         </w:rPr>
         <w:t>20</w:t>
       </w:r>
       <w:r>
         <w:rPr>
-          <w:lang w:val="en_US" w:bidi="en_US"/>
+          <w:lang w:val="el_GR" w:bidi="el_GR"/>
         </w:rPr>
         <w:t xml:space="preserve"> ζῶ δὲ οὐκέτι ἐγώ, ζῇ δὲ ἐν ἐμοὶ Χριστός· ὃ δὲ νῦν ζῶ ἐν σαρκί, ἐν πίστει ζῶ τῇ τοῦ υἱοῦ τοῦ θεοῦ τοῦ ἀγαπήσαντός με καὶ παραδόντος ἑαυτὸν ὑπὲρ ἐμοῦ.</w:t>
       </w:r>
@@ -1140,19 +1140,19 @@
       <w:pPr/>
       <w:r>
         <w:rPr>
-          <w:lang w:val="en_US" w:bidi="en_US"/>
-        </w:rPr>
-      </w:r>
-      <w:r>
-        <w:rPr>
-          <w:vertAlign w:val="superscript"/>
-          <w:lang w:val="en_US" w:bidi="en_US"/>
+          <w:lang w:val="el_GR" w:bidi="el_GR"/>
+        </w:rPr>
+      </w:r>
+      <w:r>
+        <w:rPr>
+          <w:vertAlign w:val="superscript"/>
+          <w:lang w:val="el_GR" w:bidi="el_GR"/>
         </w:rPr>
         <w:t>21</w:t>
       </w:r>
       <w:r>
         <w:rPr>
-          <w:lang w:val="en_US" w:bidi="en_US"/>
+          <w:lang w:val="el_GR" w:bidi="el_GR"/>
         </w:rPr>
         <w:t xml:space="preserve"> οὐκ ἀθετῶ τὴν χάριν τοῦ θεοῦ· εἰ γὰρ διὰ νόμου δικαιοσύνη, ἄρα Χριστὸς δωρεὰν ἀπέθανεν.</w:t>
       </w:r>
@@ -1163,33 +1163,33 @@
       </w:pPr>
       <w:r>
         <w:rPr>
-          <w:lang w:val="en_US" w:bidi="en_US"/>
+          <w:lang w:val="el_GR" w:bidi="el_GR"/>
         </w:rPr>
         <w:t>Galatians 3:1</w:t>
       </w:r>
       <w:r>
         <w:rPr>
-          <w:lang w:val="en_US" w:bidi="en_US"/>
-        </w:rPr>
-      </w:r>
-    </w:p>
-    <w:p>
-      <w:pPr/>
-      <w:r>
-        <w:rPr>
-          <w:lang w:val="en_US" w:bidi="en_US"/>
-        </w:rPr>
-      </w:r>
-      <w:r>
-        <w:rPr>
-          <w:vertAlign w:val="superscript"/>
-          <w:lang w:val="en_US" w:bidi="en_US"/>
+          <w:lang w:val="el_GR" w:bidi="el_GR"/>
+        </w:rPr>
+      </w:r>
+    </w:p>
+    <w:p>
+      <w:pPr/>
+      <w:r>
+        <w:rPr>
+          <w:lang w:val="el_GR" w:bidi="el_GR"/>
+        </w:rPr>
+      </w:r>
+      <w:r>
+        <w:rPr>
+          <w:vertAlign w:val="superscript"/>
+          <w:lang w:val="el_GR" w:bidi="el_GR"/>
         </w:rPr>
         <w:t>1</w:t>
       </w:r>
       <w:r>
         <w:rPr>
-          <w:lang w:val="en_US" w:bidi="en_US"/>
+          <w:lang w:val="el_GR" w:bidi="el_GR"/>
         </w:rPr>
         <w:t xml:space="preserve"> Ὦ ἀνόητοι Γαλάται, τίς ὑμᾶς ἐβάσκανεν, οἷς κατʼ ὀφθαλμοὺς Ἰησοῦς Χριστὸς προεγράφη ἐσταυρωμένος;</w:t>
       </w:r>
@@ -1198,19 +1198,19 @@
       <w:pPr/>
       <w:r>
         <w:rPr>
-          <w:lang w:val="en_US" w:bidi="en_US"/>
-        </w:rPr>
-      </w:r>
-      <w:r>
-        <w:rPr>
-          <w:vertAlign w:val="superscript"/>
-          <w:lang w:val="en_US" w:bidi="en_US"/>
+          <w:lang w:val="el_GR" w:bidi="el_GR"/>
+        </w:rPr>
+      </w:r>
+      <w:r>
+        <w:rPr>
+          <w:vertAlign w:val="superscript"/>
+          <w:lang w:val="el_GR" w:bidi="el_GR"/>
         </w:rPr>
         <w:t>2</w:t>
       </w:r>
       <w:r>
         <w:rPr>
-          <w:lang w:val="en_US" w:bidi="en_US"/>
+          <w:lang w:val="el_GR" w:bidi="el_GR"/>
         </w:rPr>
         <w:t xml:space="preserve"> τοῦτο μόνον θέλω μαθεῖν ἀφʼ ὑμῶν, ἐξ ἔργων νόμου τὸ πνεῦμα ἐλάβετε ἢ ἐξ ἀκοῆς πίστεως;</w:t>
       </w:r>
@@ -1219,19 +1219,19 @@
       <w:pPr/>
       <w:r>
         <w:rPr>
-          <w:lang w:val="en_US" w:bidi="en_US"/>
-        </w:rPr>
-      </w:r>
-      <w:r>
-        <w:rPr>
-          <w:vertAlign w:val="superscript"/>
-          <w:lang w:val="en_US" w:bidi="en_US"/>
+          <w:lang w:val="el_GR" w:bidi="el_GR"/>
+        </w:rPr>
+      </w:r>
+      <w:r>
+        <w:rPr>
+          <w:vertAlign w:val="superscript"/>
+          <w:lang w:val="el_GR" w:bidi="el_GR"/>
         </w:rPr>
         <w:t>3</w:t>
       </w:r>
       <w:r>
         <w:rPr>
-          <w:lang w:val="en_US" w:bidi="en_US"/>
+          <w:lang w:val="el_GR" w:bidi="el_GR"/>
         </w:rPr>
         <w:t xml:space="preserve"> οὕτως ἀνόητοί ἐστε; ἐναρξάμενοι πνεύματι νῦν σαρκὶ ἐπιτελεῖσθε;</w:t>
       </w:r>
@@ -1240,19 +1240,19 @@
       <w:pPr/>
       <w:r>
         <w:rPr>
-          <w:lang w:val="en_US" w:bidi="en_US"/>
-        </w:rPr>
-      </w:r>
-      <w:r>
-        <w:rPr>
-          <w:vertAlign w:val="superscript"/>
-          <w:lang w:val="en_US" w:bidi="en_US"/>
+          <w:lang w:val="el_GR" w:bidi="el_GR"/>
+        </w:rPr>
+      </w:r>
+      <w:r>
+        <w:rPr>
+          <w:vertAlign w:val="superscript"/>
+          <w:lang w:val="el_GR" w:bidi="el_GR"/>
         </w:rPr>
         <w:t>4</w:t>
       </w:r>
       <w:r>
         <w:rPr>
-          <w:lang w:val="en_US" w:bidi="en_US"/>
+          <w:lang w:val="el_GR" w:bidi="el_GR"/>
         </w:rPr>
         <w:t xml:space="preserve"> τοσαῦτα ἐπάθετε εἰκῇ; εἴ γε καὶ εἰκῇ.</w:t>
       </w:r>
@@ -1261,19 +1261,19 @@
       <w:pPr/>
       <w:r>
         <w:rPr>
-          <w:lang w:val="en_US" w:bidi="en_US"/>
-        </w:rPr>
-      </w:r>
-      <w:r>
-        <w:rPr>
-          <w:vertAlign w:val="superscript"/>
-          <w:lang w:val="en_US" w:bidi="en_US"/>
+          <w:lang w:val="el_GR" w:bidi="el_GR"/>
+        </w:rPr>
+      </w:r>
+      <w:r>
+        <w:rPr>
+          <w:vertAlign w:val="superscript"/>
+          <w:lang w:val="el_GR" w:bidi="el_GR"/>
         </w:rPr>
         <w:t>5</w:t>
       </w:r>
       <w:r>
         <w:rPr>
-          <w:lang w:val="en_US" w:bidi="en_US"/>
+          <w:lang w:val="el_GR" w:bidi="el_GR"/>
         </w:rPr>
         <w:t xml:space="preserve"> ὁ οὖν ἐπιχορηγῶν ὑμῖν τὸ πνεῦμα καὶ ἐνεργῶν δυνάμεις ἐν ὑμῖν ἐξ ἔργων νόμου ἢ ἐξ ἀκοῆς πίστεως;</w:t>
       </w:r>
@@ -1282,19 +1282,19 @@
       <w:pPr/>
       <w:r>
         <w:rPr>
-          <w:lang w:val="en_US" w:bidi="en_US"/>
-        </w:rPr>
-      </w:r>
-      <w:r>
-        <w:rPr>
-          <w:vertAlign w:val="superscript"/>
-          <w:lang w:val="en_US" w:bidi="en_US"/>
+          <w:lang w:val="el_GR" w:bidi="el_GR"/>
+        </w:rPr>
+      </w:r>
+      <w:r>
+        <w:rPr>
+          <w:vertAlign w:val="superscript"/>
+          <w:lang w:val="el_GR" w:bidi="el_GR"/>
         </w:rPr>
         <w:t>6</w:t>
       </w:r>
       <w:r>
         <w:rPr>
-          <w:lang w:val="en_US" w:bidi="en_US"/>
+          <w:lang w:val="el_GR" w:bidi="el_GR"/>
         </w:rPr>
         <w:t xml:space="preserve"> καθὼς Ἀβραὰμ ἐπίστευσεν τῷ θεῷ, καὶ ἐλογίσθη αὐτῷ εἰς δικαιοσύνην.</w:t>
       </w:r>
@@ -1303,19 +1303,19 @@
       <w:pPr/>
       <w:r>
         <w:rPr>
-          <w:lang w:val="en_US" w:bidi="en_US"/>
-        </w:rPr>
-      </w:r>
-      <w:r>
-        <w:rPr>
-          <w:vertAlign w:val="superscript"/>
-          <w:lang w:val="en_US" w:bidi="en_US"/>
+          <w:lang w:val="el_GR" w:bidi="el_GR"/>
+        </w:rPr>
+      </w:r>
+      <w:r>
+        <w:rPr>
+          <w:vertAlign w:val="superscript"/>
+          <w:lang w:val="el_GR" w:bidi="el_GR"/>
         </w:rPr>
         <w:t>7</w:t>
       </w:r>
       <w:r>
         <w:rPr>
-          <w:lang w:val="en_US" w:bidi="en_US"/>
+          <w:lang w:val="el_GR" w:bidi="el_GR"/>
         </w:rPr>
         <w:t xml:space="preserve"> Γινώσκετε ἄρα ὅτι οἱ ἐκ πίστεως, οὗτοι υἱοί εἰσιν Ἀβραάμ.</w:t>
       </w:r>
@@ -1324,19 +1324,19 @@
       <w:pPr/>
       <w:r>
         <w:rPr>
-          <w:lang w:val="en_US" w:bidi="en_US"/>
-        </w:rPr>
-      </w:r>
-      <w:r>
-        <w:rPr>
-          <w:vertAlign w:val="superscript"/>
-          <w:lang w:val="en_US" w:bidi="en_US"/>
+          <w:lang w:val="el_GR" w:bidi="el_GR"/>
+        </w:rPr>
+      </w:r>
+      <w:r>
+        <w:rPr>
+          <w:vertAlign w:val="superscript"/>
+          <w:lang w:val="el_GR" w:bidi="el_GR"/>
         </w:rPr>
         <w:t>8</w:t>
       </w:r>
       <w:r>
         <w:rPr>
-          <w:lang w:val="en_US" w:bidi="en_US"/>
+          <w:lang w:val="el_GR" w:bidi="el_GR"/>
         </w:rPr>
         <w:t xml:space="preserve"> προϊδοῦσα δὲ ἡ γραφὴ ὅτι ἐκ πίστεως δικαιοῖ τὰ ἔθνη ὁ θεὸς προευηγγελίσατο τῷ Ἀβραὰμ ὅτι Ἐνευλογηθήσονται ἐν σοὶ πάντα τὰ ἔθνη.</w:t>
       </w:r>
@@ -1345,19 +1345,19 @@
       <w:pPr/>
       <w:r>
         <w:rPr>
-          <w:lang w:val="en_US" w:bidi="en_US"/>
-        </w:rPr>
-      </w:r>
-      <w:r>
-        <w:rPr>
-          <w:vertAlign w:val="superscript"/>
-          <w:lang w:val="en_US" w:bidi="en_US"/>
+          <w:lang w:val="el_GR" w:bidi="el_GR"/>
+        </w:rPr>
+      </w:r>
+      <w:r>
+        <w:rPr>
+          <w:vertAlign w:val="superscript"/>
+          <w:lang w:val="el_GR" w:bidi="el_GR"/>
         </w:rPr>
         <w:t>9</w:t>
       </w:r>
       <w:r>
         <w:rPr>
-          <w:lang w:val="en_US" w:bidi="en_US"/>
+          <w:lang w:val="el_GR" w:bidi="el_GR"/>
         </w:rPr>
         <w:t xml:space="preserve"> ὥστε οἱ ἐκ πίστεως εὐλογοῦνται σὺν τῷ πιστῷ Ἀβραάμ.</w:t>
       </w:r>
@@ -1366,19 +1366,19 @@
       <w:pPr/>
       <w:r>
         <w:rPr>
-          <w:lang w:val="en_US" w:bidi="en_US"/>
-        </w:rPr>
-      </w:r>
-      <w:r>
-        <w:rPr>
-          <w:vertAlign w:val="superscript"/>
-          <w:lang w:val="en_US" w:bidi="en_US"/>
+          <w:lang w:val="el_GR" w:bidi="el_GR"/>
+        </w:rPr>
+      </w:r>
+      <w:r>
+        <w:rPr>
+          <w:vertAlign w:val="superscript"/>
+          <w:lang w:val="el_GR" w:bidi="el_GR"/>
         </w:rPr>
         <w:t>10</w:t>
       </w:r>
       <w:r>
         <w:rPr>
-          <w:lang w:val="en_US" w:bidi="en_US"/>
+          <w:lang w:val="el_GR" w:bidi="el_GR"/>
         </w:rPr>
         <w:t xml:space="preserve"> Ὅσοι γὰρ ἐξ ἔργων νόμου εἰσὶν ὑπὸ κατάραν εἰσίν, γέγραπται γὰρ ὅτι Ἐπικατάρατος πᾶς ὃς οὐκ ἐμμένει πᾶσιν τοῖς γεγραμμένοις ἐν τῷ βιβλίῳ τοῦ νόμου τοῦ ποιῆσαι αὐτά.</w:t>
       </w:r>
@@ -1387,19 +1387,19 @@
       <w:pPr/>
       <w:r>
         <w:rPr>
-          <w:lang w:val="en_US" w:bidi="en_US"/>
-        </w:rPr>
-      </w:r>
-      <w:r>
-        <w:rPr>
-          <w:vertAlign w:val="superscript"/>
-          <w:lang w:val="en_US" w:bidi="en_US"/>
+          <w:lang w:val="el_GR" w:bidi="el_GR"/>
+        </w:rPr>
+      </w:r>
+      <w:r>
+        <w:rPr>
+          <w:vertAlign w:val="superscript"/>
+          <w:lang w:val="el_GR" w:bidi="el_GR"/>
         </w:rPr>
         <w:t>11</w:t>
       </w:r>
       <w:r>
         <w:rPr>
-          <w:lang w:val="en_US" w:bidi="en_US"/>
+          <w:lang w:val="el_GR" w:bidi="el_GR"/>
         </w:rPr>
         <w:t xml:space="preserve"> ὅτι δὲ ἐν νόμῳ οὐδεὶς δικαιοῦται παρὰ τῷ θεῷ δῆλον, ὅτι Ὁ δίκαιος ἐκ πίστεως ζήσεται,</w:t>
       </w:r>
@@ -1408,19 +1408,19 @@
       <w:pPr/>
       <w:r>
         <w:rPr>
-          <w:lang w:val="en_US" w:bidi="en_US"/>
-        </w:rPr>
-      </w:r>
-      <w:r>
-        <w:rPr>
-          <w:vertAlign w:val="superscript"/>
-          <w:lang w:val="en_US" w:bidi="en_US"/>
+          <w:lang w:val="el_GR" w:bidi="el_GR"/>
+        </w:rPr>
+      </w:r>
+      <w:r>
+        <w:rPr>
+          <w:vertAlign w:val="superscript"/>
+          <w:lang w:val="el_GR" w:bidi="el_GR"/>
         </w:rPr>
         <w:t>12</w:t>
       </w:r>
       <w:r>
         <w:rPr>
-          <w:lang w:val="en_US" w:bidi="en_US"/>
+          <w:lang w:val="el_GR" w:bidi="el_GR"/>
         </w:rPr>
         <w:t xml:space="preserve"> ὁ δὲ νόμος οὐκ ἔστιν ἐκ πίστεως, ἀλλʼ· Ὁ ποιήσας αὐτὰ ζήσεται ἐν αὐτοῖς.</w:t>
       </w:r>
@@ -1429,19 +1429,19 @@
       <w:pPr/>
       <w:r>
         <w:rPr>
-          <w:lang w:val="en_US" w:bidi="en_US"/>
-        </w:rPr>
-      </w:r>
-      <w:r>
-        <w:rPr>
-          <w:vertAlign w:val="superscript"/>
-          <w:lang w:val="en_US" w:bidi="en_US"/>
+          <w:lang w:val="el_GR" w:bidi="el_GR"/>
+        </w:rPr>
+      </w:r>
+      <w:r>
+        <w:rPr>
+          <w:vertAlign w:val="superscript"/>
+          <w:lang w:val="el_GR" w:bidi="el_GR"/>
         </w:rPr>
         <w:t>13</w:t>
       </w:r>
       <w:r>
         <w:rPr>
-          <w:lang w:val="en_US" w:bidi="en_US"/>
+          <w:lang w:val="el_GR" w:bidi="el_GR"/>
         </w:rPr>
         <w:t xml:space="preserve"> Χριστὸς ἡμᾶς ἐξηγόρασεν ἐκ τῆς κατάρας τοῦ νόμου γενόμενος ὑπὲρ ἡμῶν κατάρα, ὅτι γέγραπται· Ἐπικατάρατος πᾶς ὁ κρεμάμενος ἐπὶ ξύλου,</w:t>
       </w:r>
@@ -1450,19 +1450,19 @@
       <w:pPr/>
       <w:r>
         <w:rPr>
-          <w:lang w:val="en_US" w:bidi="en_US"/>
-        </w:rPr>
-      </w:r>
-      <w:r>
-        <w:rPr>
-          <w:vertAlign w:val="superscript"/>
-          <w:lang w:val="en_US" w:bidi="en_US"/>
+          <w:lang w:val="el_GR" w:bidi="el_GR"/>
+        </w:rPr>
+      </w:r>
+      <w:r>
+        <w:rPr>
+          <w:vertAlign w:val="superscript"/>
+          <w:lang w:val="el_GR" w:bidi="el_GR"/>
         </w:rPr>
         <w:t>14</w:t>
       </w:r>
       <w:r>
         <w:rPr>
-          <w:lang w:val="en_US" w:bidi="en_US"/>
+          <w:lang w:val="el_GR" w:bidi="el_GR"/>
         </w:rPr>
         <w:t xml:space="preserve"> ἵνα εἰς τὰ ἔθνη ἡ εὐλογία τοῦ Ἀβραὰμ γένηται ἐν Χριστῷ Ἰησοῦ, ἵνα τὴν ἐπαγγελίαν τοῦ πνεύματος λάβωμεν διὰ τῆς πίστεως.</w:t>
       </w:r>
@@ -1471,19 +1471,19 @@
       <w:pPr/>
       <w:r>
         <w:rPr>
-          <w:lang w:val="en_US" w:bidi="en_US"/>
-        </w:rPr>
-      </w:r>
-      <w:r>
-        <w:rPr>
-          <w:vertAlign w:val="superscript"/>
-          <w:lang w:val="en_US" w:bidi="en_US"/>
+          <w:lang w:val="el_GR" w:bidi="el_GR"/>
+        </w:rPr>
+      </w:r>
+      <w:r>
+        <w:rPr>
+          <w:vertAlign w:val="superscript"/>
+          <w:lang w:val="el_GR" w:bidi="el_GR"/>
         </w:rPr>
         <w:t>15</w:t>
       </w:r>
       <w:r>
         <w:rPr>
-          <w:lang w:val="en_US" w:bidi="en_US"/>
+          <w:lang w:val="el_GR" w:bidi="el_GR"/>
         </w:rPr>
         <w:t xml:space="preserve"> Ἀδελφοί, κατὰ ἄνθρωπον λέγω· ὅμως ἀνθρώπου κεκυρωμένην διαθήκην οὐδεὶς ἀθετεῖ ἢ ἐπιδιατάσσεται.</w:t>
       </w:r>
@@ -1492,19 +1492,19 @@
       <w:pPr/>
       <w:r>
         <w:rPr>
-          <w:lang w:val="en_US" w:bidi="en_US"/>
-        </w:rPr>
-      </w:r>
-      <w:r>
-        <w:rPr>
-          <w:vertAlign w:val="superscript"/>
-          <w:lang w:val="en_US" w:bidi="en_US"/>
+          <w:lang w:val="el_GR" w:bidi="el_GR"/>
+        </w:rPr>
+      </w:r>
+      <w:r>
+        <w:rPr>
+          <w:vertAlign w:val="superscript"/>
+          <w:lang w:val="el_GR" w:bidi="el_GR"/>
         </w:rPr>
         <w:t>16</w:t>
       </w:r>
       <w:r>
         <w:rPr>
-          <w:lang w:val="en_US" w:bidi="en_US"/>
+          <w:lang w:val="el_GR" w:bidi="el_GR"/>
         </w:rPr>
         <w:t xml:space="preserve"> τῷ δὲ Ἀβραὰμ ἐρρέθησαν αἱ ἐπαγγελίαι καὶ τῷ σπέρματι αὐτοῦ· οὐ λέγει· Καὶ τοῖς σπέρμασιν, ὡς ἐπὶ πολλῶν, ἀλλʼ ὡς ἐφʼ ἑνός· Καὶ τῷ σπέρματί σου, ὅς ἐστιν Χριστός.</w:t>
       </w:r>
@@ -1513,19 +1513,19 @@
       <w:pPr/>
       <w:r>
         <w:rPr>
-          <w:lang w:val="en_US" w:bidi="en_US"/>
-        </w:rPr>
-      </w:r>
-      <w:r>
-        <w:rPr>
-          <w:vertAlign w:val="superscript"/>
-          <w:lang w:val="en_US" w:bidi="en_US"/>
+          <w:lang w:val="el_GR" w:bidi="el_GR"/>
+        </w:rPr>
+      </w:r>
+      <w:r>
+        <w:rPr>
+          <w:vertAlign w:val="superscript"/>
+          <w:lang w:val="el_GR" w:bidi="el_GR"/>
         </w:rPr>
         <w:t>17</w:t>
       </w:r>
       <w:r>
         <w:rPr>
-          <w:lang w:val="en_US" w:bidi="en_US"/>
+          <w:lang w:val="el_GR" w:bidi="el_GR"/>
         </w:rPr>
         <w:t xml:space="preserve"> τοῦτο δὲ λέγω· διαθήκην προκεκυρωμένην ὑπὸ τοῦ θεοῦ ὁ μετὰ τετρακόσια καὶ τριάκοντα ἔτη γεγονὼς νόμος οὐκ ἀκυροῖ, εἰς τὸ καταργῆσαι τὴν ἐπαγγελίαν.</w:t>
       </w:r>
@@ -1534,19 +1534,19 @@
       <w:pPr/>
       <w:r>
         <w:rPr>
-          <w:lang w:val="en_US" w:bidi="en_US"/>
-        </w:rPr>
-      </w:r>
-      <w:r>
-        <w:rPr>
-          <w:vertAlign w:val="superscript"/>
-          <w:lang w:val="en_US" w:bidi="en_US"/>
+          <w:lang w:val="el_GR" w:bidi="el_GR"/>
+        </w:rPr>
+      </w:r>
+      <w:r>
+        <w:rPr>
+          <w:vertAlign w:val="superscript"/>
+          <w:lang w:val="el_GR" w:bidi="el_GR"/>
         </w:rPr>
         <w:t>18</w:t>
       </w:r>
       <w:r>
         <w:rPr>
-          <w:lang w:val="en_US" w:bidi="en_US"/>
+          <w:lang w:val="el_GR" w:bidi="el_GR"/>
         </w:rPr>
         <w:t xml:space="preserve"> εἰ γὰρ ἐκ νόμου ἡ κληρονομία, οὐκέτι ἐξ ἐπαγγελίας· τῷ δὲ Ἀβραὰμ διʼ ἐπαγγελίας κεχάρισται ὁ θεός.</w:t>
       </w:r>
@@ -1555,19 +1555,19 @@
       <w:pPr/>
       <w:r>
         <w:rPr>
-          <w:lang w:val="en_US" w:bidi="en_US"/>
-        </w:rPr>
-      </w:r>
-      <w:r>
-        <w:rPr>
-          <w:vertAlign w:val="superscript"/>
-          <w:lang w:val="en_US" w:bidi="en_US"/>
+          <w:lang w:val="el_GR" w:bidi="el_GR"/>
+        </w:rPr>
+      </w:r>
+      <w:r>
+        <w:rPr>
+          <w:vertAlign w:val="superscript"/>
+          <w:lang w:val="el_GR" w:bidi="el_GR"/>
         </w:rPr>
         <w:t>19</w:t>
       </w:r>
       <w:r>
         <w:rPr>
-          <w:lang w:val="en_US" w:bidi="en_US"/>
+          <w:lang w:val="el_GR" w:bidi="el_GR"/>
         </w:rPr>
         <w:t xml:space="preserve"> Τί οὖν ὁ νόμος; τῶν παραβάσεων χάριν προσετέθη, ἄχρις οὗ ἔλθῃ τὸ σπέρμα ᾧ ἐπήγγελται, διαταγεὶς διʼ ἀγγέλων ἐν χειρὶ μεσίτου·</w:t>
       </w:r>
@@ -1576,19 +1576,19 @@
       <w:pPr/>
       <w:r>
         <w:rPr>
-          <w:lang w:val="en_US" w:bidi="en_US"/>
-        </w:rPr>
-      </w:r>
-      <w:r>
-        <w:rPr>
-          <w:vertAlign w:val="superscript"/>
-          <w:lang w:val="en_US" w:bidi="en_US"/>
+          <w:lang w:val="el_GR" w:bidi="el_GR"/>
+        </w:rPr>
+      </w:r>
+      <w:r>
+        <w:rPr>
+          <w:vertAlign w:val="superscript"/>
+          <w:lang w:val="el_GR" w:bidi="el_GR"/>
         </w:rPr>
         <w:t>20</w:t>
       </w:r>
       <w:r>
         <w:rPr>
-          <w:lang w:val="en_US" w:bidi="en_US"/>
+          <w:lang w:val="el_GR" w:bidi="el_GR"/>
         </w:rPr>
         <w:t xml:space="preserve"> ὁ δὲ μεσίτης ἑνὸς οὐκ ἔστιν, ὁ δὲ θεὸς εἷς ἐστιν.</w:t>
       </w:r>
@@ -1597,19 +1597,19 @@
       <w:pPr/>
       <w:r>
         <w:rPr>
-          <w:lang w:val="en_US" w:bidi="en_US"/>
-        </w:rPr>
-      </w:r>
-      <w:r>
-        <w:rPr>
-          <w:vertAlign w:val="superscript"/>
-          <w:lang w:val="en_US" w:bidi="en_US"/>
+          <w:lang w:val="el_GR" w:bidi="el_GR"/>
+        </w:rPr>
+      </w:r>
+      <w:r>
+        <w:rPr>
+          <w:vertAlign w:val="superscript"/>
+          <w:lang w:val="el_GR" w:bidi="el_GR"/>
         </w:rPr>
         <w:t>21</w:t>
       </w:r>
       <w:r>
         <w:rPr>
-          <w:lang w:val="en_US" w:bidi="en_US"/>
+          <w:lang w:val="el_GR" w:bidi="el_GR"/>
         </w:rPr>
         <w:t xml:space="preserve"> Ὁ οὖν νόμος κατὰ τῶν ἐπαγγελιῶν τοῦ θεοῦ; μὴ γένοιτο· εἰ γὰρ ἐδόθη νόμος ὁ δυνάμενος ζῳοποιῆσαι, ὄντως ἐκ νόμου ἂν ἦν ἡ δικαιοσύνη.</w:t>
       </w:r>
@@ -1618,19 +1618,19 @@
       <w:pPr/>
       <w:r>
         <w:rPr>
-          <w:lang w:val="en_US" w:bidi="en_US"/>
-        </w:rPr>
-      </w:r>
-      <w:r>
-        <w:rPr>
-          <w:vertAlign w:val="superscript"/>
-          <w:lang w:val="en_US" w:bidi="en_US"/>
+          <w:lang w:val="el_GR" w:bidi="el_GR"/>
+        </w:rPr>
+      </w:r>
+      <w:r>
+        <w:rPr>
+          <w:vertAlign w:val="superscript"/>
+          <w:lang w:val="el_GR" w:bidi="el_GR"/>
         </w:rPr>
         <w:t>22</w:t>
       </w:r>
       <w:r>
         <w:rPr>
-          <w:lang w:val="en_US" w:bidi="en_US"/>
+          <w:lang w:val="el_GR" w:bidi="el_GR"/>
         </w:rPr>
         <w:t xml:space="preserve"> ἀλλὰ συνέκλεισεν ἡ γραφὴ τὰ πάντα ὑπὸ ἁμαρτίαν ἵνα ἡ ἐπαγγελία ἐκ πίστεως Ἰησοῦ Χριστοῦ δοθῇ τοῖς πιστεύουσιν.</w:t>
       </w:r>
@@ -1639,19 +1639,19 @@
       <w:pPr/>
       <w:r>
         <w:rPr>
-          <w:lang w:val="en_US" w:bidi="en_US"/>
-        </w:rPr>
-      </w:r>
-      <w:r>
-        <w:rPr>
-          <w:vertAlign w:val="superscript"/>
-          <w:lang w:val="en_US" w:bidi="en_US"/>
+          <w:lang w:val="el_GR" w:bidi="el_GR"/>
+        </w:rPr>
+      </w:r>
+      <w:r>
+        <w:rPr>
+          <w:vertAlign w:val="superscript"/>
+          <w:lang w:val="el_GR" w:bidi="el_GR"/>
         </w:rPr>
         <w:t>23</w:t>
       </w:r>
       <w:r>
         <w:rPr>
-          <w:lang w:val="en_US" w:bidi="en_US"/>
+          <w:lang w:val="el_GR" w:bidi="el_GR"/>
         </w:rPr>
         <w:t xml:space="preserve"> Πρὸ τοῦ δὲ ἐλθεῖν τὴν πίστιν ὑπὸ νόμον ἐφρουρούμεθα συγκλειόμενοι εἰς τὴν μέλλουσαν πίστιν ἀποκαλυφθῆναι.</w:t>
       </w:r>
@@ -1660,19 +1660,19 @@
       <w:pPr/>
       <w:r>
         <w:rPr>
-          <w:lang w:val="en_US" w:bidi="en_US"/>
-        </w:rPr>
-      </w:r>
-      <w:r>
-        <w:rPr>
-          <w:vertAlign w:val="superscript"/>
-          <w:lang w:val="en_US" w:bidi="en_US"/>
+          <w:lang w:val="el_GR" w:bidi="el_GR"/>
+        </w:rPr>
+      </w:r>
+      <w:r>
+        <w:rPr>
+          <w:vertAlign w:val="superscript"/>
+          <w:lang w:val="el_GR" w:bidi="el_GR"/>
         </w:rPr>
         <w:t>24</w:t>
       </w:r>
       <w:r>
         <w:rPr>
-          <w:lang w:val="en_US" w:bidi="en_US"/>
+          <w:lang w:val="el_GR" w:bidi="el_GR"/>
         </w:rPr>
         <w:t xml:space="preserve"> ὥστε ὁ νόμος παιδαγωγὸς ἡμῶν γέγονεν εἰς Χριστόν, ἵνα ἐκ πίστεως δικαιωθῶμεν·</w:t>
       </w:r>
@@ -1681,19 +1681,19 @@
       <w:pPr/>
       <w:r>
         <w:rPr>
-          <w:lang w:val="en_US" w:bidi="en_US"/>
-        </w:rPr>
-      </w:r>
-      <w:r>
-        <w:rPr>
-          <w:vertAlign w:val="superscript"/>
-          <w:lang w:val="en_US" w:bidi="en_US"/>
+          <w:lang w:val="el_GR" w:bidi="el_GR"/>
+        </w:rPr>
+      </w:r>
+      <w:r>
+        <w:rPr>
+          <w:vertAlign w:val="superscript"/>
+          <w:lang w:val="el_GR" w:bidi="el_GR"/>
         </w:rPr>
         <w:t>25</w:t>
       </w:r>
       <w:r>
         <w:rPr>
-          <w:lang w:val="en_US" w:bidi="en_US"/>
+          <w:lang w:val="el_GR" w:bidi="el_GR"/>
         </w:rPr>
         <w:t xml:space="preserve"> ἐλθούσης δὲ τῆς πίστεως οὐκέτι ὑπὸ παιδαγωγόν ἐσμεν.</w:t>
       </w:r>
@@ -1702,19 +1702,19 @@
       <w:pPr/>
       <w:r>
         <w:rPr>
-          <w:lang w:val="en_US" w:bidi="en_US"/>
-        </w:rPr>
-      </w:r>
-      <w:r>
-        <w:rPr>
-          <w:vertAlign w:val="superscript"/>
-          <w:lang w:val="en_US" w:bidi="en_US"/>
+          <w:lang w:val="el_GR" w:bidi="el_GR"/>
+        </w:rPr>
+      </w:r>
+      <w:r>
+        <w:rPr>
+          <w:vertAlign w:val="superscript"/>
+          <w:lang w:val="el_GR" w:bidi="el_GR"/>
         </w:rPr>
         <w:t>26</w:t>
       </w:r>
       <w:r>
         <w:rPr>
-          <w:lang w:val="en_US" w:bidi="en_US"/>
+          <w:lang w:val="el_GR" w:bidi="el_GR"/>
         </w:rPr>
         <w:t xml:space="preserve"> πάντες γὰρ υἱοὶ θεοῦ ἐστε διὰ τῆς πίστεως ἐν Χριστῷ Ἰησοῦ.</w:t>
       </w:r>
@@ -1723,19 +1723,19 @@
       <w:pPr/>
       <w:r>
         <w:rPr>
-          <w:lang w:val="en_US" w:bidi="en_US"/>
-        </w:rPr>
-      </w:r>
-      <w:r>
-        <w:rPr>
-          <w:vertAlign w:val="superscript"/>
-          <w:lang w:val="en_US" w:bidi="en_US"/>
+          <w:lang w:val="el_GR" w:bidi="el_GR"/>
+        </w:rPr>
+      </w:r>
+      <w:r>
+        <w:rPr>
+          <w:vertAlign w:val="superscript"/>
+          <w:lang w:val="el_GR" w:bidi="el_GR"/>
         </w:rPr>
         <w:t>27</w:t>
       </w:r>
       <w:r>
         <w:rPr>
-          <w:lang w:val="en_US" w:bidi="en_US"/>
+          <w:lang w:val="el_GR" w:bidi="el_GR"/>
         </w:rPr>
         <w:t xml:space="preserve"> ὅσοι γὰρ εἰς Χριστὸν ἐβαπτίσθητε, Χριστὸν ἐνεδύσασθε·</w:t>
       </w:r>
@@ -1744,19 +1744,19 @@
       <w:pPr/>
       <w:r>
         <w:rPr>
-          <w:lang w:val="en_US" w:bidi="en_US"/>
-        </w:rPr>
-      </w:r>
-      <w:r>
-        <w:rPr>
-          <w:vertAlign w:val="superscript"/>
-          <w:lang w:val="en_US" w:bidi="en_US"/>
+          <w:lang w:val="el_GR" w:bidi="el_GR"/>
+        </w:rPr>
+      </w:r>
+      <w:r>
+        <w:rPr>
+          <w:vertAlign w:val="superscript"/>
+          <w:lang w:val="el_GR" w:bidi="el_GR"/>
         </w:rPr>
         <w:t>28</w:t>
       </w:r>
       <w:r>
         <w:rPr>
-          <w:lang w:val="en_US" w:bidi="en_US"/>
+          <w:lang w:val="el_GR" w:bidi="el_GR"/>
         </w:rPr>
         <w:t xml:space="preserve"> οὐκ ἔνι Ἰουδαῖος οὐδὲ Ἕλλην, οὐκ ἔνι δοῦλος οὐδὲ ἐλεύθερος, οὐκ ἔνι ἄρσεν καὶ θῆλυ· πάντες γὰρ ὑμεῖς εἷς ἐστε ἐν Χριστῷ Ἰησοῦ.</w:t>
       </w:r>
@@ -1765,19 +1765,19 @@
       <w:pPr/>
       <w:r>
         <w:rPr>
-          <w:lang w:val="en_US" w:bidi="en_US"/>
-        </w:rPr>
-      </w:r>
-      <w:r>
-        <w:rPr>
-          <w:vertAlign w:val="superscript"/>
-          <w:lang w:val="en_US" w:bidi="en_US"/>
+          <w:lang w:val="el_GR" w:bidi="el_GR"/>
+        </w:rPr>
+      </w:r>
+      <w:r>
+        <w:rPr>
+          <w:vertAlign w:val="superscript"/>
+          <w:lang w:val="el_GR" w:bidi="el_GR"/>
         </w:rPr>
         <w:t>29</w:t>
       </w:r>
       <w:r>
         <w:rPr>
-          <w:lang w:val="en_US" w:bidi="en_US"/>
+          <w:lang w:val="el_GR" w:bidi="el_GR"/>
         </w:rPr>
         <w:t xml:space="preserve"> εἰ δὲ ὑμεῖς Χριστοῦ, ἄρα τοῦ Ἀβραὰμ σπέρμα ἐστέ, κατʼ ἐπαγγελίαν κληρονόμοι.</w:t>
       </w:r>
@@ -1788,33 +1788,33 @@
       </w:pPr>
       <w:r>
         <w:rPr>
-          <w:lang w:val="en_US" w:bidi="en_US"/>
+          <w:lang w:val="el_GR" w:bidi="el_GR"/>
         </w:rPr>
         <w:t>Galatians 4:1</w:t>
       </w:r>
       <w:r>
         <w:rPr>
-          <w:lang w:val="en_US" w:bidi="en_US"/>
-        </w:rPr>
-      </w:r>
-    </w:p>
-    <w:p>
-      <w:pPr/>
-      <w:r>
-        <w:rPr>
-          <w:lang w:val="en_US" w:bidi="en_US"/>
-        </w:rPr>
-      </w:r>
-      <w:r>
-        <w:rPr>
-          <w:vertAlign w:val="superscript"/>
-          <w:lang w:val="en_US" w:bidi="en_US"/>
+          <w:lang w:val="el_GR" w:bidi="el_GR"/>
+        </w:rPr>
+      </w:r>
+    </w:p>
+    <w:p>
+      <w:pPr/>
+      <w:r>
+        <w:rPr>
+          <w:lang w:val="el_GR" w:bidi="el_GR"/>
+        </w:rPr>
+      </w:r>
+      <w:r>
+        <w:rPr>
+          <w:vertAlign w:val="superscript"/>
+          <w:lang w:val="el_GR" w:bidi="el_GR"/>
         </w:rPr>
         <w:t>1</w:t>
       </w:r>
       <w:r>
         <w:rPr>
-          <w:lang w:val="en_US" w:bidi="en_US"/>
+          <w:lang w:val="el_GR" w:bidi="el_GR"/>
         </w:rPr>
         <w:t xml:space="preserve"> Λέγω δέ, ἐφʼ ὅσον χρόνον ὁ κληρονόμος νήπιός ἐστιν, οὐδὲν διαφέρει δούλου κύριος πάντων ὤν,</w:t>
       </w:r>
@@ -1823,19 +1823,19 @@
       <w:pPr/>
       <w:r>
         <w:rPr>
-          <w:lang w:val="en_US" w:bidi="en_US"/>
-        </w:rPr>
-      </w:r>
-      <w:r>
-        <w:rPr>
-          <w:vertAlign w:val="superscript"/>
-          <w:lang w:val="en_US" w:bidi="en_US"/>
+          <w:lang w:val="el_GR" w:bidi="el_GR"/>
+        </w:rPr>
+      </w:r>
+      <w:r>
+        <w:rPr>
+          <w:vertAlign w:val="superscript"/>
+          <w:lang w:val="el_GR" w:bidi="el_GR"/>
         </w:rPr>
         <w:t>2</w:t>
       </w:r>
       <w:r>
         <w:rPr>
-          <w:lang w:val="en_US" w:bidi="en_US"/>
+          <w:lang w:val="el_GR" w:bidi="el_GR"/>
         </w:rPr>
         <w:t xml:space="preserve"> ἀλλὰ ὑπὸ ἐπιτρόπους ἐστὶ καὶ οἰκονόμους ἄχρι τῆς προθεσμίας τοῦ πατρός.</w:t>
       </w:r>
@@ -1844,19 +1844,19 @@
       <w:pPr/>
       <w:r>
         <w:rPr>
-          <w:lang w:val="en_US" w:bidi="en_US"/>
-        </w:rPr>
-      </w:r>
-      <w:r>
-        <w:rPr>
-          <w:vertAlign w:val="superscript"/>
-          <w:lang w:val="en_US" w:bidi="en_US"/>
+          <w:lang w:val="el_GR" w:bidi="el_GR"/>
+        </w:rPr>
+      </w:r>
+      <w:r>
+        <w:rPr>
+          <w:vertAlign w:val="superscript"/>
+          <w:lang w:val="el_GR" w:bidi="el_GR"/>
         </w:rPr>
         <w:t>3</w:t>
       </w:r>
       <w:r>
         <w:rPr>
-          <w:lang w:val="en_US" w:bidi="en_US"/>
+          <w:lang w:val="el_GR" w:bidi="el_GR"/>
         </w:rPr>
         <w:t xml:space="preserve"> οὕτως καὶ ἡμεῖς, ὅτε ἦμεν νήπιοι, ὑπὸ τὰ στοιχεῖα τοῦ κόσμου ἤμεθα δεδουλωμένοι·</w:t>
       </w:r>
@@ -1865,19 +1865,19 @@
       <w:pPr/>
       <w:r>
         <w:rPr>
-          <w:lang w:val="en_US" w:bidi="en_US"/>
-        </w:rPr>
-      </w:r>
-      <w:r>
-        <w:rPr>
-          <w:vertAlign w:val="superscript"/>
-          <w:lang w:val="en_US" w:bidi="en_US"/>
+          <w:lang w:val="el_GR" w:bidi="el_GR"/>
+        </w:rPr>
+      </w:r>
+      <w:r>
+        <w:rPr>
+          <w:vertAlign w:val="superscript"/>
+          <w:lang w:val="el_GR" w:bidi="el_GR"/>
         </w:rPr>
         <w:t>4</w:t>
       </w:r>
       <w:r>
         <w:rPr>
-          <w:lang w:val="en_US" w:bidi="en_US"/>
+          <w:lang w:val="el_GR" w:bidi="el_GR"/>
         </w:rPr>
         <w:t xml:space="preserve"> ὅτε δὲ ἦλθεν τὸ πλήρωμα τοῦ χρόνου, ἐξαπέστειλεν ὁ θεὸς τὸν υἱὸν αὐτοῦ, γενόμενον ἐκ γυναικός, γενόμενον ὑπὸ νόμον,</w:t>
       </w:r>
@@ -1886,19 +1886,19 @@
       <w:pPr/>
       <w:r>
         <w:rPr>
-          <w:lang w:val="en_US" w:bidi="en_US"/>
-        </w:rPr>
-      </w:r>
-      <w:r>
-        <w:rPr>
-          <w:vertAlign w:val="superscript"/>
-          <w:lang w:val="en_US" w:bidi="en_US"/>
+          <w:lang w:val="el_GR" w:bidi="el_GR"/>
+        </w:rPr>
+      </w:r>
+      <w:r>
+        <w:rPr>
+          <w:vertAlign w:val="superscript"/>
+          <w:lang w:val="el_GR" w:bidi="el_GR"/>
         </w:rPr>
         <w:t>5</w:t>
       </w:r>
       <w:r>
         <w:rPr>
-          <w:lang w:val="en_US" w:bidi="en_US"/>
+          <w:lang w:val="el_GR" w:bidi="el_GR"/>
         </w:rPr>
         <w:t xml:space="preserve"> ἵνα τοὺς ὑπὸ νόμον ἐξαγοράσῃ, ἵνα τὴν υἱοθεσίαν ἀπολάβωμεν.</w:t>
       </w:r>
@@ -1907,19 +1907,19 @@
       <w:pPr/>
       <w:r>
         <w:rPr>
-          <w:lang w:val="en_US" w:bidi="en_US"/>
-        </w:rPr>
-      </w:r>
-      <w:r>
-        <w:rPr>
-          <w:vertAlign w:val="superscript"/>
-          <w:lang w:val="en_US" w:bidi="en_US"/>
+          <w:lang w:val="el_GR" w:bidi="el_GR"/>
+        </w:rPr>
+      </w:r>
+      <w:r>
+        <w:rPr>
+          <w:vertAlign w:val="superscript"/>
+          <w:lang w:val="el_GR" w:bidi="el_GR"/>
         </w:rPr>
         <w:t>6</w:t>
       </w:r>
       <w:r>
         <w:rPr>
-          <w:lang w:val="en_US" w:bidi="en_US"/>
+          <w:lang w:val="el_GR" w:bidi="el_GR"/>
         </w:rPr>
         <w:t xml:space="preserve"> ὅτι δέ ἐστε υἱοί, ἐξαπέστειλεν ὁ θεὸς τὸ πνεῦμα τοῦ υἱοῦ αὐτοῦ εἰς τὰς καρδίας ἡμῶν, κρᾶζον· Αββα ὁ πατήρ.</w:t>
       </w:r>
@@ -1928,19 +1928,19 @@
       <w:pPr/>
       <w:r>
         <w:rPr>
-          <w:lang w:val="en_US" w:bidi="en_US"/>
-        </w:rPr>
-      </w:r>
-      <w:r>
-        <w:rPr>
-          <w:vertAlign w:val="superscript"/>
-          <w:lang w:val="en_US" w:bidi="en_US"/>
+          <w:lang w:val="el_GR" w:bidi="el_GR"/>
+        </w:rPr>
+      </w:r>
+      <w:r>
+        <w:rPr>
+          <w:vertAlign w:val="superscript"/>
+          <w:lang w:val="el_GR" w:bidi="el_GR"/>
         </w:rPr>
         <w:t>7</w:t>
       </w:r>
       <w:r>
         <w:rPr>
-          <w:lang w:val="en_US" w:bidi="en_US"/>
+          <w:lang w:val="el_GR" w:bidi="el_GR"/>
         </w:rPr>
         <w:t xml:space="preserve"> ὥστε οὐκέτι εἶ δοῦλος ἀλλὰ υἱός· εἰ δὲ υἱός, καὶ κληρονόμος διὰ θεοῦ.</w:t>
       </w:r>
@@ -1949,19 +1949,19 @@
       <w:pPr/>
       <w:r>
         <w:rPr>
-          <w:lang w:val="en_US" w:bidi="en_US"/>
-        </w:rPr>
-      </w:r>
-      <w:r>
-        <w:rPr>
-          <w:vertAlign w:val="superscript"/>
-          <w:lang w:val="en_US" w:bidi="en_US"/>
+          <w:lang w:val="el_GR" w:bidi="el_GR"/>
+        </w:rPr>
+      </w:r>
+      <w:r>
+        <w:rPr>
+          <w:vertAlign w:val="superscript"/>
+          <w:lang w:val="el_GR" w:bidi="el_GR"/>
         </w:rPr>
         <w:t>8</w:t>
       </w:r>
       <w:r>
         <w:rPr>
-          <w:lang w:val="en_US" w:bidi="en_US"/>
+          <w:lang w:val="el_GR" w:bidi="el_GR"/>
         </w:rPr>
         <w:t xml:space="preserve"> Ἀλλὰ τότε μὲν οὐκ εἰδότες θεὸν ἐδουλεύσατε τοῖς φύσει μὴ οὖσι θεοῖς·</w:t>
       </w:r>
@@ -1970,19 +1970,19 @@
       <w:pPr/>
       <w:r>
         <w:rPr>
-          <w:lang w:val="en_US" w:bidi="en_US"/>
-        </w:rPr>
-      </w:r>
-      <w:r>
-        <w:rPr>
-          <w:vertAlign w:val="superscript"/>
-          <w:lang w:val="en_US" w:bidi="en_US"/>
+          <w:lang w:val="el_GR" w:bidi="el_GR"/>
+        </w:rPr>
+      </w:r>
+      <w:r>
+        <w:rPr>
+          <w:vertAlign w:val="superscript"/>
+          <w:lang w:val="el_GR" w:bidi="el_GR"/>
         </w:rPr>
         <w:t>9</w:t>
       </w:r>
       <w:r>
         <w:rPr>
-          <w:lang w:val="en_US" w:bidi="en_US"/>
+          <w:lang w:val="el_GR" w:bidi="el_GR"/>
         </w:rPr>
         <w:t xml:space="preserve"> νῦν δὲ γνόντες θεόν, μᾶλλον δὲ γνωσθέντες ὑπὸ θεοῦ, πῶς ἐπιστρέφετε πάλιν ἐπὶ τὰ ἀσθενῆ καὶ πτωχὰ στοιχεῖα, οἷς πάλιν ἄνωθεν δουλεύειν θέλετε;</w:t>
       </w:r>
@@ -1991,19 +1991,19 @@
       <w:pPr/>
       <w:r>
         <w:rPr>
-          <w:lang w:val="en_US" w:bidi="en_US"/>
-        </w:rPr>
-      </w:r>
-      <w:r>
-        <w:rPr>
-          <w:vertAlign w:val="superscript"/>
-          <w:lang w:val="en_US" w:bidi="en_US"/>
+          <w:lang w:val="el_GR" w:bidi="el_GR"/>
+        </w:rPr>
+      </w:r>
+      <w:r>
+        <w:rPr>
+          <w:vertAlign w:val="superscript"/>
+          <w:lang w:val="el_GR" w:bidi="el_GR"/>
         </w:rPr>
         <w:t>10</w:t>
       </w:r>
       <w:r>
         <w:rPr>
-          <w:lang w:val="en_US" w:bidi="en_US"/>
+          <w:lang w:val="el_GR" w:bidi="el_GR"/>
         </w:rPr>
         <w:t xml:space="preserve"> ἡμέρας παρατηρεῖσθε καὶ μῆνας καὶ καιροὺς καὶ ἐνιαυτούς.</w:t>
       </w:r>
@@ -2012,19 +2012,19 @@
       <w:pPr/>
       <w:r>
         <w:rPr>
-          <w:lang w:val="en_US" w:bidi="en_US"/>
-        </w:rPr>
-      </w:r>
-      <w:r>
-        <w:rPr>
-          <w:vertAlign w:val="superscript"/>
-          <w:lang w:val="en_US" w:bidi="en_US"/>
+          <w:lang w:val="el_GR" w:bidi="el_GR"/>
+        </w:rPr>
+      </w:r>
+      <w:r>
+        <w:rPr>
+          <w:vertAlign w:val="superscript"/>
+          <w:lang w:val="el_GR" w:bidi="el_GR"/>
         </w:rPr>
         <w:t>11</w:t>
       </w:r>
       <w:r>
         <w:rPr>
-          <w:lang w:val="en_US" w:bidi="en_US"/>
+          <w:lang w:val="el_GR" w:bidi="el_GR"/>
         </w:rPr>
         <w:t xml:space="preserve"> φοβοῦμαι ὑμᾶς μή πως εἰκῇ κεκοπίακα εἰς ὑμᾶς.</w:t>
       </w:r>
@@ -2033,19 +2033,19 @@
       <w:pPr/>
       <w:r>
         <w:rPr>
-          <w:lang w:val="en_US" w:bidi="en_US"/>
-        </w:rPr>
-      </w:r>
-      <w:r>
-        <w:rPr>
-          <w:vertAlign w:val="superscript"/>
-          <w:lang w:val="en_US" w:bidi="en_US"/>
+          <w:lang w:val="el_GR" w:bidi="el_GR"/>
+        </w:rPr>
+      </w:r>
+      <w:r>
+        <w:rPr>
+          <w:vertAlign w:val="superscript"/>
+          <w:lang w:val="el_GR" w:bidi="el_GR"/>
         </w:rPr>
         <w:t>12</w:t>
       </w:r>
       <w:r>
         <w:rPr>
-          <w:lang w:val="en_US" w:bidi="en_US"/>
+          <w:lang w:val="el_GR" w:bidi="el_GR"/>
         </w:rPr>
         <w:t xml:space="preserve"> Γίνεσθε ὡς ἐγώ, ὅτι κἀγὼ ὡς ὑμεῖς, ἀδελφοί, δέομαι ὑμῶν. οὐδέν με ἠδικήσατε·</w:t>
       </w:r>
@@ -2054,19 +2054,19 @@
       <w:pPr/>
       <w:r>
         <w:rPr>
-          <w:lang w:val="en_US" w:bidi="en_US"/>
-        </w:rPr>
-      </w:r>
-      <w:r>
-        <w:rPr>
-          <w:vertAlign w:val="superscript"/>
-          <w:lang w:val="en_US" w:bidi="en_US"/>
+          <w:lang w:val="el_GR" w:bidi="el_GR"/>
+        </w:rPr>
+      </w:r>
+      <w:r>
+        <w:rPr>
+          <w:vertAlign w:val="superscript"/>
+          <w:lang w:val="el_GR" w:bidi="el_GR"/>
         </w:rPr>
         <w:t>13</w:t>
       </w:r>
       <w:r>
         <w:rPr>
-          <w:lang w:val="en_US" w:bidi="en_US"/>
+          <w:lang w:val="el_GR" w:bidi="el_GR"/>
         </w:rPr>
         <w:t xml:space="preserve"> οἴδατε δὲ ὅτι διʼ ἀσθένειαν τῆς σαρκὸς εὐηγγελισάμην ὑμῖν τὸ πρότερον,</w:t>
       </w:r>
@@ -2075,19 +2075,19 @@
       <w:pPr/>
       <w:r>
         <w:rPr>
-          <w:lang w:val="en_US" w:bidi="en_US"/>
-        </w:rPr>
-      </w:r>
-      <w:r>
-        <w:rPr>
-          <w:vertAlign w:val="superscript"/>
-          <w:lang w:val="en_US" w:bidi="en_US"/>
+          <w:lang w:val="el_GR" w:bidi="el_GR"/>
+        </w:rPr>
+      </w:r>
+      <w:r>
+        <w:rPr>
+          <w:vertAlign w:val="superscript"/>
+          <w:lang w:val="el_GR" w:bidi="el_GR"/>
         </w:rPr>
         <w:t>14</w:t>
       </w:r>
       <w:r>
         <w:rPr>
-          <w:lang w:val="en_US" w:bidi="en_US"/>
+          <w:lang w:val="el_GR" w:bidi="el_GR"/>
         </w:rPr>
         <w:t xml:space="preserve"> καὶ τὸν πειρασμὸν ὑμῶν ἐν τῇ σαρκί μου οὐκ ἐξουθενήσατε οὐδὲ ἐξεπτύσατε, ἀλλὰ ὡς ἄγγελον θεοῦ ἐδέξασθέ με, ὡς Χριστὸν Ἰησοῦν.</w:t>
       </w:r>
@@ -2096,19 +2096,19 @@
       <w:pPr/>
       <w:r>
         <w:rPr>
-          <w:lang w:val="en_US" w:bidi="en_US"/>
-        </w:rPr>
-      </w:r>
-      <w:r>
-        <w:rPr>
-          <w:vertAlign w:val="superscript"/>
-          <w:lang w:val="en_US" w:bidi="en_US"/>
+          <w:lang w:val="el_GR" w:bidi="el_GR"/>
+        </w:rPr>
+      </w:r>
+      <w:r>
+        <w:rPr>
+          <w:vertAlign w:val="superscript"/>
+          <w:lang w:val="el_GR" w:bidi="el_GR"/>
         </w:rPr>
         <w:t>15</w:t>
       </w:r>
       <w:r>
         <w:rPr>
-          <w:lang w:val="en_US" w:bidi="en_US"/>
+          <w:lang w:val="el_GR" w:bidi="el_GR"/>
         </w:rPr>
         <w:t xml:space="preserve"> ποῦ οὖν ὁ μακαρισμὸς ὑμῶν; μαρτυρῶ γὰρ ὑμῖν ὅτι εἰ δυνατὸν τοὺς ὀφθαλμοὺς ὑμῶν ἐξορύξαντες ἐδώκατέ μοι.</w:t>
       </w:r>
@@ -2117,19 +2117,19 @@
       <w:pPr/>
       <w:r>
         <w:rPr>
-          <w:lang w:val="en_US" w:bidi="en_US"/>
-        </w:rPr>
-      </w:r>
-      <w:r>
-        <w:rPr>
-          <w:vertAlign w:val="superscript"/>
-          <w:lang w:val="en_US" w:bidi="en_US"/>
+          <w:lang w:val="el_GR" w:bidi="el_GR"/>
+        </w:rPr>
+      </w:r>
+      <w:r>
+        <w:rPr>
+          <w:vertAlign w:val="superscript"/>
+          <w:lang w:val="el_GR" w:bidi="el_GR"/>
         </w:rPr>
         <w:t>16</w:t>
       </w:r>
       <w:r>
         <w:rPr>
-          <w:lang w:val="en_US" w:bidi="en_US"/>
+          <w:lang w:val="el_GR" w:bidi="el_GR"/>
         </w:rPr>
         <w:t xml:space="preserve"> ὥστε ἐχθρὸς ὑμῶν γέγονα ἀληθεύων ὑμῖν;</w:t>
       </w:r>
@@ -2138,19 +2138,19 @@
       <w:pPr/>
       <w:r>
         <w:rPr>
-          <w:lang w:val="en_US" w:bidi="en_US"/>
-        </w:rPr>
-      </w:r>
-      <w:r>
-        <w:rPr>
-          <w:vertAlign w:val="superscript"/>
-          <w:lang w:val="en_US" w:bidi="en_US"/>
+          <w:lang w:val="el_GR" w:bidi="el_GR"/>
+        </w:rPr>
+      </w:r>
+      <w:r>
+        <w:rPr>
+          <w:vertAlign w:val="superscript"/>
+          <w:lang w:val="el_GR" w:bidi="el_GR"/>
         </w:rPr>
         <w:t>17</w:t>
       </w:r>
       <w:r>
         <w:rPr>
-          <w:lang w:val="en_US" w:bidi="en_US"/>
+          <w:lang w:val="el_GR" w:bidi="el_GR"/>
         </w:rPr>
         <w:t xml:space="preserve"> ζηλοῦσιν ὑμᾶς οὐ καλῶς, ἀλλὰ ἐκκλεῖσαι ὑμᾶς θέλουσιν, ἵνα αὐτοὺς ζηλοῦτε.</w:t>
       </w:r>
@@ -2159,19 +2159,19 @@
       <w:pPr/>
       <w:r>
         <w:rPr>
-          <w:lang w:val="en_US" w:bidi="en_US"/>
-        </w:rPr>
-      </w:r>
-      <w:r>
-        <w:rPr>
-          <w:vertAlign w:val="superscript"/>
-          <w:lang w:val="en_US" w:bidi="en_US"/>
+          <w:lang w:val="el_GR" w:bidi="el_GR"/>
+        </w:rPr>
+      </w:r>
+      <w:r>
+        <w:rPr>
+          <w:vertAlign w:val="superscript"/>
+          <w:lang w:val="el_GR" w:bidi="el_GR"/>
         </w:rPr>
         <w:t>18</w:t>
       </w:r>
       <w:r>
         <w:rPr>
-          <w:lang w:val="en_US" w:bidi="en_US"/>
+          <w:lang w:val="el_GR" w:bidi="el_GR"/>
         </w:rPr>
         <w:t xml:space="preserve"> καλὸν δὲ ζηλοῦσθαι ἐν καλῷ πάντοτε, καὶ μὴ μόνον ἐν τῷ παρεῖναί με πρὸς ὑμᾶς,</w:t>
       </w:r>
@@ -2180,19 +2180,19 @@
       <w:pPr/>
       <w:r>
         <w:rPr>
-          <w:lang w:val="en_US" w:bidi="en_US"/>
-        </w:rPr>
-      </w:r>
-      <w:r>
-        <w:rPr>
-          <w:vertAlign w:val="superscript"/>
-          <w:lang w:val="en_US" w:bidi="en_US"/>
+          <w:lang w:val="el_GR" w:bidi="el_GR"/>
+        </w:rPr>
+      </w:r>
+      <w:r>
+        <w:rPr>
+          <w:vertAlign w:val="superscript"/>
+          <w:lang w:val="el_GR" w:bidi="el_GR"/>
         </w:rPr>
         <w:t>19</w:t>
       </w:r>
       <w:r>
         <w:rPr>
-          <w:lang w:val="en_US" w:bidi="en_US"/>
+          <w:lang w:val="el_GR" w:bidi="el_GR"/>
         </w:rPr>
         <w:t xml:space="preserve"> τέκνα μου, οὓς πάλιν ὠδίνω μέχρις οὗ μορφωθῇ Χριστὸς ἐν ὑμῖν·</w:t>
       </w:r>
@@ -2201,19 +2201,19 @@
       <w:pPr/>
       <w:r>
         <w:rPr>
-          <w:lang w:val="en_US" w:bidi="en_US"/>
-        </w:rPr>
-      </w:r>
-      <w:r>
-        <w:rPr>
-          <w:vertAlign w:val="superscript"/>
-          <w:lang w:val="en_US" w:bidi="en_US"/>
+          <w:lang w:val="el_GR" w:bidi="el_GR"/>
+        </w:rPr>
+      </w:r>
+      <w:r>
+        <w:rPr>
+          <w:vertAlign w:val="superscript"/>
+          <w:lang w:val="el_GR" w:bidi="el_GR"/>
         </w:rPr>
         <w:t>20</w:t>
       </w:r>
       <w:r>
         <w:rPr>
-          <w:lang w:val="en_US" w:bidi="en_US"/>
+          <w:lang w:val="el_GR" w:bidi="el_GR"/>
         </w:rPr>
         <w:t xml:space="preserve"> ἤθελον δὲ παρεῖναι πρὸς ὑμᾶς ἄρτι, καὶ ἀλλάξαι τὴν φωνήν μου, ὅτι ἀποροῦμαι ἐν ὑμῖν.</w:t>
       </w:r>
@@ -2222,19 +2222,19 @@
       <w:pPr/>
       <w:r>
         <w:rPr>
-          <w:lang w:val="en_US" w:bidi="en_US"/>
-        </w:rPr>
-      </w:r>
-      <w:r>
-        <w:rPr>
-          <w:vertAlign w:val="superscript"/>
-          <w:lang w:val="en_US" w:bidi="en_US"/>
+          <w:lang w:val="el_GR" w:bidi="el_GR"/>
+        </w:rPr>
+      </w:r>
+      <w:r>
+        <w:rPr>
+          <w:vertAlign w:val="superscript"/>
+          <w:lang w:val="el_GR" w:bidi="el_GR"/>
         </w:rPr>
         <w:t>21</w:t>
       </w:r>
       <w:r>
         <w:rPr>
-          <w:lang w:val="en_US" w:bidi="en_US"/>
+          <w:lang w:val="el_GR" w:bidi="el_GR"/>
         </w:rPr>
         <w:t xml:space="preserve"> Λέγετέ μοι, οἱ ὑπὸ νόμον θέλοντες εἶναι, τὸν νόμον οὐκ ἀκούετε;</w:t>
       </w:r>
@@ -2243,19 +2243,19 @@
       <w:pPr/>
       <w:r>
         <w:rPr>
-          <w:lang w:val="en_US" w:bidi="en_US"/>
-        </w:rPr>
-      </w:r>
-      <w:r>
-        <w:rPr>
-          <w:vertAlign w:val="superscript"/>
-          <w:lang w:val="en_US" w:bidi="en_US"/>
+          <w:lang w:val="el_GR" w:bidi="el_GR"/>
+        </w:rPr>
+      </w:r>
+      <w:r>
+        <w:rPr>
+          <w:vertAlign w:val="superscript"/>
+          <w:lang w:val="el_GR" w:bidi="el_GR"/>
         </w:rPr>
         <w:t>22</w:t>
       </w:r>
       <w:r>
         <w:rPr>
-          <w:lang w:val="en_US" w:bidi="en_US"/>
+          <w:lang w:val="el_GR" w:bidi="el_GR"/>
         </w:rPr>
         <w:t xml:space="preserve"> γέγραπται γὰρ ὅτι Ἀβραὰμ δύο υἱοὺς ἔσχεν, ἕνα ἐκ τῆς παιδίσκης καὶ ἕνα ἐκ τῆς ἐλευθέρας·</w:t>
       </w:r>
@@ -2264,19 +2264,19 @@
       <w:pPr/>
       <w:r>
         <w:rPr>
-          <w:lang w:val="en_US" w:bidi="en_US"/>
-        </w:rPr>
-      </w:r>
-      <w:r>
-        <w:rPr>
-          <w:vertAlign w:val="superscript"/>
-          <w:lang w:val="en_US" w:bidi="en_US"/>
+          <w:lang w:val="el_GR" w:bidi="el_GR"/>
+        </w:rPr>
+      </w:r>
+      <w:r>
+        <w:rPr>
+          <w:vertAlign w:val="superscript"/>
+          <w:lang w:val="el_GR" w:bidi="el_GR"/>
         </w:rPr>
         <w:t>23</w:t>
       </w:r>
       <w:r>
         <w:rPr>
-          <w:lang w:val="en_US" w:bidi="en_US"/>
+          <w:lang w:val="el_GR" w:bidi="el_GR"/>
         </w:rPr>
         <w:t xml:space="preserve"> ἀλλʼ ὁ μὲν ἐκ τῆς παιδίσκης κατὰ σάρκα γεγέννηται, ὁ δὲ ἐκ τῆς ἐλευθέρας διʼ ἐπαγγελίας.</w:t>
       </w:r>
@@ -2285,19 +2285,19 @@
       <w:pPr/>
       <w:r>
         <w:rPr>
-          <w:lang w:val="en_US" w:bidi="en_US"/>
-        </w:rPr>
-      </w:r>
-      <w:r>
-        <w:rPr>
-          <w:vertAlign w:val="superscript"/>
-          <w:lang w:val="en_US" w:bidi="en_US"/>
+          <w:lang w:val="el_GR" w:bidi="el_GR"/>
+        </w:rPr>
+      </w:r>
+      <w:r>
+        <w:rPr>
+          <w:vertAlign w:val="superscript"/>
+          <w:lang w:val="el_GR" w:bidi="el_GR"/>
         </w:rPr>
         <w:t>24</w:t>
       </w:r>
       <w:r>
         <w:rPr>
-          <w:lang w:val="en_US" w:bidi="en_US"/>
+          <w:lang w:val="el_GR" w:bidi="el_GR"/>
         </w:rPr>
         <w:t xml:space="preserve"> ἅτινά ἐστιν ἀλληγορούμενα· αὗται γάρ εἰσιν δύο διαθῆκαι, μία μὲν ἀπὸ ὄρους Σινᾶ, εἰς δουλείαν γεννῶσα, ἥτις ἐστὶν Ἁγάρ,</w:t>
       </w:r>
@@ -2306,19 +2306,19 @@
       <w:pPr/>
       <w:r>
         <w:rPr>
-          <w:lang w:val="en_US" w:bidi="en_US"/>
-        </w:rPr>
-      </w:r>
-      <w:r>
-        <w:rPr>
-          <w:vertAlign w:val="superscript"/>
-          <w:lang w:val="en_US" w:bidi="en_US"/>
+          <w:lang w:val="el_GR" w:bidi="el_GR"/>
+        </w:rPr>
+      </w:r>
+      <w:r>
+        <w:rPr>
+          <w:vertAlign w:val="superscript"/>
+          <w:lang w:val="el_GR" w:bidi="el_GR"/>
         </w:rPr>
         <w:t>25</w:t>
       </w:r>
       <w:r>
         <w:rPr>
-          <w:lang w:val="en_US" w:bidi="en_US"/>
+          <w:lang w:val="el_GR" w:bidi="el_GR"/>
         </w:rPr>
         <w:t xml:space="preserve"> τὸ δὲ Ἁγὰρ Σινᾶ ὄρος ἐστὶν ἐν τῇ Ἀραβίᾳ, συστοιχεῖ δὲ τῇ νῦν Ἰερουσαλήμ, δουλεύει γὰρ μετὰ τῶν τέκνων αὐτῆς·</w:t>
       </w:r>
@@ -2327,19 +2327,19 @@
       <w:pPr/>
       <w:r>
         <w:rPr>
-          <w:lang w:val="en_US" w:bidi="en_US"/>
-        </w:rPr>
-      </w:r>
-      <w:r>
-        <w:rPr>
-          <w:vertAlign w:val="superscript"/>
-          <w:lang w:val="en_US" w:bidi="en_US"/>
+          <w:lang w:val="el_GR" w:bidi="el_GR"/>
+        </w:rPr>
+      </w:r>
+      <w:r>
+        <w:rPr>
+          <w:vertAlign w:val="superscript"/>
+          <w:lang w:val="el_GR" w:bidi="el_GR"/>
         </w:rPr>
         <w:t>26</w:t>
       </w:r>
       <w:r>
         <w:rPr>
-          <w:lang w:val="en_US" w:bidi="en_US"/>
+          <w:lang w:val="el_GR" w:bidi="el_GR"/>
         </w:rPr>
         <w:t xml:space="preserve"> ἡ δὲ ἄνω Ἰερουσαλὴμ ἐλευθέρα ἐστίν, ἥτις ἐστὶν μήτηρ ἡμῶν·</w:t>
       </w:r>
@@ -2348,19 +2348,19 @@
       <w:pPr/>
       <w:r>
         <w:rPr>
-          <w:lang w:val="en_US" w:bidi="en_US"/>
-        </w:rPr>
-      </w:r>
-      <w:r>
-        <w:rPr>
-          <w:vertAlign w:val="superscript"/>
-          <w:lang w:val="en_US" w:bidi="en_US"/>
+          <w:lang w:val="el_GR" w:bidi="el_GR"/>
+        </w:rPr>
+      </w:r>
+      <w:r>
+        <w:rPr>
+          <w:vertAlign w:val="superscript"/>
+          <w:lang w:val="el_GR" w:bidi="el_GR"/>
         </w:rPr>
         <w:t>27</w:t>
       </w:r>
       <w:r>
         <w:rPr>
-          <w:lang w:val="en_US" w:bidi="en_US"/>
+          <w:lang w:val="el_GR" w:bidi="el_GR"/>
         </w:rPr>
         <w:t xml:space="preserve"> γέγραπται γάρ· Εὐφράνθητι, στεῖρα ἡ οὐ τίκτουσα, ῥῆξον καὶ βόησον, ἡ οὐκ ὠδίνουσα· ὅτι πολλὰ τὰ τέκνα τῆς ἐρήμου μᾶλλον ἢ τῆς ἐχούσης τὸν ἄνδρα.</w:t>
       </w:r>
@@ -2369,19 +2369,19 @@
       <w:pPr/>
       <w:r>
         <w:rPr>
-          <w:lang w:val="en_US" w:bidi="en_US"/>
-        </w:rPr>
-      </w:r>
-      <w:r>
-        <w:rPr>
-          <w:vertAlign w:val="superscript"/>
-          <w:lang w:val="en_US" w:bidi="en_US"/>
+          <w:lang w:val="el_GR" w:bidi="el_GR"/>
+        </w:rPr>
+      </w:r>
+      <w:r>
+        <w:rPr>
+          <w:vertAlign w:val="superscript"/>
+          <w:lang w:val="el_GR" w:bidi="el_GR"/>
         </w:rPr>
         <w:t>28</w:t>
       </w:r>
       <w:r>
         <w:rPr>
-          <w:lang w:val="en_US" w:bidi="en_US"/>
+          <w:lang w:val="el_GR" w:bidi="el_GR"/>
         </w:rPr>
         <w:t xml:space="preserve"> ὑμεῖς δέ, ἀδελφοί, κατὰ Ἰσαὰκ ἐπαγγελίας τέκνα ἐστέ·</w:t>
       </w:r>
@@ -2390,19 +2390,19 @@
       <w:pPr/>
       <w:r>
         <w:rPr>
-          <w:lang w:val="en_US" w:bidi="en_US"/>
-        </w:rPr>
-      </w:r>
-      <w:r>
-        <w:rPr>
-          <w:vertAlign w:val="superscript"/>
-          <w:lang w:val="en_US" w:bidi="en_US"/>
+          <w:lang w:val="el_GR" w:bidi="el_GR"/>
+        </w:rPr>
+      </w:r>
+      <w:r>
+        <w:rPr>
+          <w:vertAlign w:val="superscript"/>
+          <w:lang w:val="el_GR" w:bidi="el_GR"/>
         </w:rPr>
         <w:t>29</w:t>
       </w:r>
       <w:r>
         <w:rPr>
-          <w:lang w:val="en_US" w:bidi="en_US"/>
+          <w:lang w:val="el_GR" w:bidi="el_GR"/>
         </w:rPr>
         <w:t xml:space="preserve"> ἀλλʼ ὥσπερ τότε ὁ κατὰ σάρκα γεννηθεὶς ἐδίωκε τὸν κατὰ πνεῦμα, οὕτως καὶ νῦν.</w:t>
       </w:r>
@@ -2411,19 +2411,19 @@
       <w:pPr/>
       <w:r>
         <w:rPr>
-          <w:lang w:val="en_US" w:bidi="en_US"/>
-        </w:rPr>
-      </w:r>
-      <w:r>
-        <w:rPr>
-          <w:vertAlign w:val="superscript"/>
-          <w:lang w:val="en_US" w:bidi="en_US"/>
+          <w:lang w:val="el_GR" w:bidi="el_GR"/>
+        </w:rPr>
+      </w:r>
+      <w:r>
+        <w:rPr>
+          <w:vertAlign w:val="superscript"/>
+          <w:lang w:val="el_GR" w:bidi="el_GR"/>
         </w:rPr>
         <w:t>30</w:t>
       </w:r>
       <w:r>
         <w:rPr>
-          <w:lang w:val="en_US" w:bidi="en_US"/>
+          <w:lang w:val="el_GR" w:bidi="el_GR"/>
         </w:rPr>
         <w:t xml:space="preserve"> ἀλλὰ τί λέγει ἡ γραφή; Ἔκβαλε τὴν παιδίσκην καὶ τὸν υἱὸν αὐτῆς, οὐ γὰρ μὴ κληρονομήσει ὁ υἱὸς τῆς παιδίσκης μετὰ τοῦ υἱοῦ τῆς ἐλευθέρας.</w:t>
       </w:r>
@@ -2432,19 +2432,19 @@
       <w:pPr/>
       <w:r>
         <w:rPr>
-          <w:lang w:val="en_US" w:bidi="en_US"/>
-        </w:rPr>
-      </w:r>
-      <w:r>
-        <w:rPr>
-          <w:vertAlign w:val="superscript"/>
-          <w:lang w:val="en_US" w:bidi="en_US"/>
+          <w:lang w:val="el_GR" w:bidi="el_GR"/>
+        </w:rPr>
+      </w:r>
+      <w:r>
+        <w:rPr>
+          <w:vertAlign w:val="superscript"/>
+          <w:lang w:val="el_GR" w:bidi="el_GR"/>
         </w:rPr>
         <w:t>31</w:t>
       </w:r>
       <w:r>
         <w:rPr>
-          <w:lang w:val="en_US" w:bidi="en_US"/>
+          <w:lang w:val="el_GR" w:bidi="el_GR"/>
         </w:rPr>
         <w:t xml:space="preserve"> διό, ἀδελφοί, οὐκ ἐσμὲν παιδίσκης τέκνα ἀλλὰ τῆς ἐλευθέρας.</w:t>
       </w:r>
@@ -2455,33 +2455,33 @@
       </w:pPr>
       <w:r>
         <w:rPr>
-          <w:lang w:val="en_US" w:bidi="en_US"/>
+          <w:lang w:val="el_GR" w:bidi="el_GR"/>
         </w:rPr>
         <w:t>Galatians 5:1</w:t>
       </w:r>
       <w:r>
         <w:rPr>
-          <w:lang w:val="en_US" w:bidi="en_US"/>
-        </w:rPr>
-      </w:r>
-    </w:p>
-    <w:p>
-      <w:pPr/>
-      <w:r>
-        <w:rPr>
-          <w:lang w:val="en_US" w:bidi="en_US"/>
-        </w:rPr>
-      </w:r>
-      <w:r>
-        <w:rPr>
-          <w:vertAlign w:val="superscript"/>
-          <w:lang w:val="en_US" w:bidi="en_US"/>
+          <w:lang w:val="el_GR" w:bidi="el_GR"/>
+        </w:rPr>
+      </w:r>
+    </w:p>
+    <w:p>
+      <w:pPr/>
+      <w:r>
+        <w:rPr>
+          <w:lang w:val="el_GR" w:bidi="el_GR"/>
+        </w:rPr>
+      </w:r>
+      <w:r>
+        <w:rPr>
+          <w:vertAlign w:val="superscript"/>
+          <w:lang w:val="el_GR" w:bidi="el_GR"/>
         </w:rPr>
         <w:t>1</w:t>
       </w:r>
       <w:r>
         <w:rPr>
-          <w:lang w:val="en_US" w:bidi="en_US"/>
+          <w:lang w:val="el_GR" w:bidi="el_GR"/>
         </w:rPr>
         <w:t xml:space="preserve"> τῇ ἐλευθερίᾳ ἡμᾶς Χριστὸς ἠλευθέρωσεν· στήκετε οὖν καὶ μὴ πάλιν ζυγῷ δουλείας ἐνέχεσθε.</w:t>
       </w:r>
@@ -2490,19 +2490,19 @@
       <w:pPr/>
       <w:r>
         <w:rPr>
-          <w:lang w:val="en_US" w:bidi="en_US"/>
-        </w:rPr>
-      </w:r>
-      <w:r>
-        <w:rPr>
-          <w:vertAlign w:val="superscript"/>
-          <w:lang w:val="en_US" w:bidi="en_US"/>
+          <w:lang w:val="el_GR" w:bidi="el_GR"/>
+        </w:rPr>
+      </w:r>
+      <w:r>
+        <w:rPr>
+          <w:vertAlign w:val="superscript"/>
+          <w:lang w:val="el_GR" w:bidi="el_GR"/>
         </w:rPr>
         <w:t>2</w:t>
       </w:r>
       <w:r>
         <w:rPr>
-          <w:lang w:val="en_US" w:bidi="en_US"/>
+          <w:lang w:val="el_GR" w:bidi="el_GR"/>
         </w:rPr>
         <w:t xml:space="preserve"> Ἴδε ἐγὼ Παῦλος λέγω ὑμῖν ὅτι ἐὰν περιτέμνησθε Χριστὸς ὑμᾶς οὐδὲν ὠφελήσει.</w:t>
       </w:r>
@@ -2511,19 +2511,19 @@
       <w:pPr/>
       <w:r>
         <w:rPr>
-          <w:lang w:val="en_US" w:bidi="en_US"/>
-        </w:rPr>
-      </w:r>
-      <w:r>
-        <w:rPr>
-          <w:vertAlign w:val="superscript"/>
-          <w:lang w:val="en_US" w:bidi="en_US"/>
+          <w:lang w:val="el_GR" w:bidi="el_GR"/>
+        </w:rPr>
+      </w:r>
+      <w:r>
+        <w:rPr>
+          <w:vertAlign w:val="superscript"/>
+          <w:lang w:val="el_GR" w:bidi="el_GR"/>
         </w:rPr>
         <w:t>3</w:t>
       </w:r>
       <w:r>
         <w:rPr>
-          <w:lang w:val="en_US" w:bidi="en_US"/>
+          <w:lang w:val="el_GR" w:bidi="el_GR"/>
         </w:rPr>
         <w:t xml:space="preserve"> μαρτύρομαι δὲ πάλιν παντὶ ἀνθρώπῳ περιτεμνομένῳ ὅτι ὀφειλέτης ἐστὶν ὅλον τὸν νόμον ποιῆσαι.</w:t>
       </w:r>
@@ -2532,19 +2532,19 @@
       <w:pPr/>
       <w:r>
         <w:rPr>
-          <w:lang w:val="en_US" w:bidi="en_US"/>
-        </w:rPr>
-      </w:r>
-      <w:r>
-        <w:rPr>
-          <w:vertAlign w:val="superscript"/>
-          <w:lang w:val="en_US" w:bidi="en_US"/>
+          <w:lang w:val="el_GR" w:bidi="el_GR"/>
+        </w:rPr>
+      </w:r>
+      <w:r>
+        <w:rPr>
+          <w:vertAlign w:val="superscript"/>
+          <w:lang w:val="el_GR" w:bidi="el_GR"/>
         </w:rPr>
         <w:t>4</w:t>
       </w:r>
       <w:r>
         <w:rPr>
-          <w:lang w:val="en_US" w:bidi="en_US"/>
+          <w:lang w:val="el_GR" w:bidi="el_GR"/>
         </w:rPr>
         <w:t xml:space="preserve"> κατηργήθητε ἀπὸ Χριστοῦ οἵτινες ἐν νόμῳ δικαιοῦσθε, τῆς χάριτος ἐξεπέσατε.</w:t>
       </w:r>
@@ -2553,19 +2553,19 @@
       <w:pPr/>
       <w:r>
         <w:rPr>
-          <w:lang w:val="en_US" w:bidi="en_US"/>
-        </w:rPr>
-      </w:r>
-      <w:r>
-        <w:rPr>
-          <w:vertAlign w:val="superscript"/>
-          <w:lang w:val="en_US" w:bidi="en_US"/>
+          <w:lang w:val="el_GR" w:bidi="el_GR"/>
+        </w:rPr>
+      </w:r>
+      <w:r>
+        <w:rPr>
+          <w:vertAlign w:val="superscript"/>
+          <w:lang w:val="el_GR" w:bidi="el_GR"/>
         </w:rPr>
         <w:t>5</w:t>
       </w:r>
       <w:r>
         <w:rPr>
-          <w:lang w:val="en_US" w:bidi="en_US"/>
+          <w:lang w:val="el_GR" w:bidi="el_GR"/>
         </w:rPr>
         <w:t xml:space="preserve"> ἡμεῖς γὰρ πνεύματι ἐκ πίστεως ἐλπίδα δικαιοσύνης ἀπεκδεχόμεθα.</w:t>
       </w:r>
@@ -2574,19 +2574,19 @@
       <w:pPr/>
       <w:r>
         <w:rPr>
-          <w:lang w:val="en_US" w:bidi="en_US"/>
-        </w:rPr>
-      </w:r>
-      <w:r>
-        <w:rPr>
-          <w:vertAlign w:val="superscript"/>
-          <w:lang w:val="en_US" w:bidi="en_US"/>
+          <w:lang w:val="el_GR" w:bidi="el_GR"/>
+        </w:rPr>
+      </w:r>
+      <w:r>
+        <w:rPr>
+          <w:vertAlign w:val="superscript"/>
+          <w:lang w:val="el_GR" w:bidi="el_GR"/>
         </w:rPr>
         <w:t>6</w:t>
       </w:r>
       <w:r>
         <w:rPr>
-          <w:lang w:val="en_US" w:bidi="en_US"/>
+          <w:lang w:val="el_GR" w:bidi="el_GR"/>
         </w:rPr>
         <w:t xml:space="preserve"> ἐν γὰρ Χριστῷ Ἰησοῦ οὔτε περιτομή τι ἰσχύει οὔτε ἀκροβυστία, ἀλλὰ πίστις διʼ ἀγάπης ἐνεργουμένη.</w:t>
       </w:r>
@@ -2595,19 +2595,19 @@
       <w:pPr/>
       <w:r>
         <w:rPr>
-          <w:lang w:val="en_US" w:bidi="en_US"/>
-        </w:rPr>
-      </w:r>
-      <w:r>
-        <w:rPr>
-          <w:vertAlign w:val="superscript"/>
-          <w:lang w:val="en_US" w:bidi="en_US"/>
+          <w:lang w:val="el_GR" w:bidi="el_GR"/>
+        </w:rPr>
+      </w:r>
+      <w:r>
+        <w:rPr>
+          <w:vertAlign w:val="superscript"/>
+          <w:lang w:val="el_GR" w:bidi="el_GR"/>
         </w:rPr>
         <w:t>7</w:t>
       </w:r>
       <w:r>
         <w:rPr>
-          <w:lang w:val="en_US" w:bidi="en_US"/>
+          <w:lang w:val="el_GR" w:bidi="el_GR"/>
         </w:rPr>
         <w:t xml:space="preserve"> Ἐτρέχετε καλῶς· τίς ὑμᾶς ἐνέκοψεν τῇ ἀληθείᾳ μὴ πείθεσθαι;</w:t>
       </w:r>
@@ -2616,19 +2616,19 @@
       <w:pPr/>
       <w:r>
         <w:rPr>
-          <w:lang w:val="en_US" w:bidi="en_US"/>
-        </w:rPr>
-      </w:r>
-      <w:r>
-        <w:rPr>
-          <w:vertAlign w:val="superscript"/>
-          <w:lang w:val="en_US" w:bidi="en_US"/>
+          <w:lang w:val="el_GR" w:bidi="el_GR"/>
+        </w:rPr>
+      </w:r>
+      <w:r>
+        <w:rPr>
+          <w:vertAlign w:val="superscript"/>
+          <w:lang w:val="el_GR" w:bidi="el_GR"/>
         </w:rPr>
         <w:t>8</w:t>
       </w:r>
       <w:r>
         <w:rPr>
-          <w:lang w:val="en_US" w:bidi="en_US"/>
+          <w:lang w:val="el_GR" w:bidi="el_GR"/>
         </w:rPr>
         <w:t xml:space="preserve"> ἡ πεισμονὴ οὐκ ἐκ τοῦ καλοῦντος ὑμᾶς.</w:t>
       </w:r>
@@ -2637,19 +2637,19 @@
       <w:pPr/>
       <w:r>
         <w:rPr>
-          <w:lang w:val="en_US" w:bidi="en_US"/>
-        </w:rPr>
-      </w:r>
-      <w:r>
-        <w:rPr>
-          <w:vertAlign w:val="superscript"/>
-          <w:lang w:val="en_US" w:bidi="en_US"/>
+          <w:lang w:val="el_GR" w:bidi="el_GR"/>
+        </w:rPr>
+      </w:r>
+      <w:r>
+        <w:rPr>
+          <w:vertAlign w:val="superscript"/>
+          <w:lang w:val="el_GR" w:bidi="el_GR"/>
         </w:rPr>
         <w:t>9</w:t>
       </w:r>
       <w:r>
         <w:rPr>
-          <w:lang w:val="en_US" w:bidi="en_US"/>
+          <w:lang w:val="el_GR" w:bidi="el_GR"/>
         </w:rPr>
         <w:t xml:space="preserve"> μικρὰ ζύμη ὅλον τὸ φύραμα ζυμοῖ.</w:t>
       </w:r>
@@ -2658,19 +2658,19 @@
       <w:pPr/>
       <w:r>
         <w:rPr>
-          <w:lang w:val="en_US" w:bidi="en_US"/>
-        </w:rPr>
-      </w:r>
-      <w:r>
-        <w:rPr>
-          <w:vertAlign w:val="superscript"/>
-          <w:lang w:val="en_US" w:bidi="en_US"/>
+          <w:lang w:val="el_GR" w:bidi="el_GR"/>
+        </w:rPr>
+      </w:r>
+      <w:r>
+        <w:rPr>
+          <w:vertAlign w:val="superscript"/>
+          <w:lang w:val="el_GR" w:bidi="el_GR"/>
         </w:rPr>
         <w:t>10</w:t>
       </w:r>
       <w:r>
         <w:rPr>
-          <w:lang w:val="en_US" w:bidi="en_US"/>
+          <w:lang w:val="el_GR" w:bidi="el_GR"/>
         </w:rPr>
         <w:t xml:space="preserve"> ἐγὼ πέποιθα εἰς ὑμᾶς ἐν κυρίῳ ὅτι οὐδὲν ἄλλο φρονήσετε· ὁ δὲ ταράσσων ὑμᾶς βαστάσει τὸ κρίμα, ὅστις ἐὰν ᾖ.</w:t>
       </w:r>
@@ -2679,19 +2679,19 @@
       <w:pPr/>
       <w:r>
         <w:rPr>
-          <w:lang w:val="en_US" w:bidi="en_US"/>
-        </w:rPr>
-      </w:r>
-      <w:r>
-        <w:rPr>
-          <w:vertAlign w:val="superscript"/>
-          <w:lang w:val="en_US" w:bidi="en_US"/>
+          <w:lang w:val="el_GR" w:bidi="el_GR"/>
+        </w:rPr>
+      </w:r>
+      <w:r>
+        <w:rPr>
+          <w:vertAlign w:val="superscript"/>
+          <w:lang w:val="el_GR" w:bidi="el_GR"/>
         </w:rPr>
         <w:t>11</w:t>
       </w:r>
       <w:r>
         <w:rPr>
-          <w:lang w:val="en_US" w:bidi="en_US"/>
+          <w:lang w:val="el_GR" w:bidi="el_GR"/>
         </w:rPr>
         <w:t xml:space="preserve"> ἐγὼ δέ, ἀδελφοί, εἰ περιτομὴν ἔτι κηρύσσω, τί ἔτι διώκομαι; ἄρα κατήργηται τὸ σκάνδαλον τοῦ σταυροῦ.</w:t>
       </w:r>
@@ -2700,19 +2700,19 @@
       <w:pPr/>
       <w:r>
         <w:rPr>
-          <w:lang w:val="en_US" w:bidi="en_US"/>
-        </w:rPr>
-      </w:r>
-      <w:r>
-        <w:rPr>
-          <w:vertAlign w:val="superscript"/>
-          <w:lang w:val="en_US" w:bidi="en_US"/>
+          <w:lang w:val="el_GR" w:bidi="el_GR"/>
+        </w:rPr>
+      </w:r>
+      <w:r>
+        <w:rPr>
+          <w:vertAlign w:val="superscript"/>
+          <w:lang w:val="el_GR" w:bidi="el_GR"/>
         </w:rPr>
         <w:t>12</w:t>
       </w:r>
       <w:r>
         <w:rPr>
-          <w:lang w:val="en_US" w:bidi="en_US"/>
+          <w:lang w:val="el_GR" w:bidi="el_GR"/>
         </w:rPr>
         <w:t xml:space="preserve"> ὄφελον καὶ ἀποκόψονται οἱ ἀναστατοῦντες ὑμᾶς.</w:t>
       </w:r>
@@ -2721,19 +2721,19 @@
       <w:pPr/>
       <w:r>
         <w:rPr>
-          <w:lang w:val="en_US" w:bidi="en_US"/>
-        </w:rPr>
-      </w:r>
-      <w:r>
-        <w:rPr>
-          <w:vertAlign w:val="superscript"/>
-          <w:lang w:val="en_US" w:bidi="en_US"/>
+          <w:lang w:val="el_GR" w:bidi="el_GR"/>
+        </w:rPr>
+      </w:r>
+      <w:r>
+        <w:rPr>
+          <w:vertAlign w:val="superscript"/>
+          <w:lang w:val="el_GR" w:bidi="el_GR"/>
         </w:rPr>
         <w:t>13</w:t>
       </w:r>
       <w:r>
         <w:rPr>
-          <w:lang w:val="en_US" w:bidi="en_US"/>
+          <w:lang w:val="el_GR" w:bidi="el_GR"/>
         </w:rPr>
         <w:t xml:space="preserve"> Ὑμεῖς γὰρ ἐπʼ ἐλευθερίᾳ ἐκλήθητε, ἀδελφοί· μόνον μὴ τὴν ἐλευθερίαν εἰς ἀφορμὴν τῇ σαρκί, ἀλλὰ διὰ τῆς ἀγάπης δουλεύετε ἀλλήλοις·</w:t>
       </w:r>
@@ -2742,19 +2742,19 @@
       <w:pPr/>
       <w:r>
         <w:rPr>
-          <w:lang w:val="en_US" w:bidi="en_US"/>
-        </w:rPr>
-      </w:r>
-      <w:r>
-        <w:rPr>
-          <w:vertAlign w:val="superscript"/>
-          <w:lang w:val="en_US" w:bidi="en_US"/>
+          <w:lang w:val="el_GR" w:bidi="el_GR"/>
+        </w:rPr>
+      </w:r>
+      <w:r>
+        <w:rPr>
+          <w:vertAlign w:val="superscript"/>
+          <w:lang w:val="el_GR" w:bidi="el_GR"/>
         </w:rPr>
         <w:t>14</w:t>
       </w:r>
       <w:r>
         <w:rPr>
-          <w:lang w:val="en_US" w:bidi="en_US"/>
+          <w:lang w:val="el_GR" w:bidi="el_GR"/>
         </w:rPr>
         <w:t xml:space="preserve"> ὁ γὰρ πᾶς νόμος ἐν ἑνὶ λόγῳ πεπλήρωται, ἐν τῷ· Ἀγαπήσεις τὸν πλησίον σου ὡς σεαυτόν.</w:t>
       </w:r>
@@ -2763,19 +2763,19 @@
       <w:pPr/>
       <w:r>
         <w:rPr>
-          <w:lang w:val="en_US" w:bidi="en_US"/>
-        </w:rPr>
-      </w:r>
-      <w:r>
-        <w:rPr>
-          <w:vertAlign w:val="superscript"/>
-          <w:lang w:val="en_US" w:bidi="en_US"/>
+          <w:lang w:val="el_GR" w:bidi="el_GR"/>
+        </w:rPr>
+      </w:r>
+      <w:r>
+        <w:rPr>
+          <w:vertAlign w:val="superscript"/>
+          <w:lang w:val="el_GR" w:bidi="el_GR"/>
         </w:rPr>
         <w:t>15</w:t>
       </w:r>
       <w:r>
         <w:rPr>
-          <w:lang w:val="en_US" w:bidi="en_US"/>
+          <w:lang w:val="el_GR" w:bidi="el_GR"/>
         </w:rPr>
         <w:t xml:space="preserve"> εἰ δὲ ἀλλήλους δάκνετε καὶ κατεσθίετε, βλέπετε μὴ ὑπʼ ἀλλήλων ἀναλωθῆτε.</w:t>
       </w:r>
@@ -2784,19 +2784,19 @@
       <w:pPr/>
       <w:r>
         <w:rPr>
-          <w:lang w:val="en_US" w:bidi="en_US"/>
-        </w:rPr>
-      </w:r>
-      <w:r>
-        <w:rPr>
-          <w:vertAlign w:val="superscript"/>
-          <w:lang w:val="en_US" w:bidi="en_US"/>
+          <w:lang w:val="el_GR" w:bidi="el_GR"/>
+        </w:rPr>
+      </w:r>
+      <w:r>
+        <w:rPr>
+          <w:vertAlign w:val="superscript"/>
+          <w:lang w:val="el_GR" w:bidi="el_GR"/>
         </w:rPr>
         <w:t>16</w:t>
       </w:r>
       <w:r>
         <w:rPr>
-          <w:lang w:val="en_US" w:bidi="en_US"/>
+          <w:lang w:val="el_GR" w:bidi="el_GR"/>
         </w:rPr>
         <w:t xml:space="preserve"> Λέγω δέ, πνεύματι περιπατεῖτε καὶ ἐπιθυμίαν σαρκὸς οὐ μὴ τελέσητε.</w:t>
       </w:r>
@@ -2805,19 +2805,19 @@
       <w:pPr/>
       <w:r>
         <w:rPr>
-          <w:lang w:val="en_US" w:bidi="en_US"/>
-        </w:rPr>
-      </w:r>
-      <w:r>
-        <w:rPr>
-          <w:vertAlign w:val="superscript"/>
-          <w:lang w:val="en_US" w:bidi="en_US"/>
+          <w:lang w:val="el_GR" w:bidi="el_GR"/>
+        </w:rPr>
+      </w:r>
+      <w:r>
+        <w:rPr>
+          <w:vertAlign w:val="superscript"/>
+          <w:lang w:val="el_GR" w:bidi="el_GR"/>
         </w:rPr>
         <w:t>17</w:t>
       </w:r>
       <w:r>
         <w:rPr>
-          <w:lang w:val="en_US" w:bidi="en_US"/>
+          <w:lang w:val="el_GR" w:bidi="el_GR"/>
         </w:rPr>
         <w:t xml:space="preserve"> ἡ γὰρ σὰρξ ἐπιθυμεῖ κατὰ τοῦ πνεύματος, τὸ δὲ πνεῦμα κατὰ τῆς σαρκός, ταῦτα γὰρ ἀλλήλοις ἀντίκειται, ἵνα μὴ ἃ ἐὰν θέλητε ταῦτα ποιῆτε.</w:t>
       </w:r>
@@ -2826,19 +2826,19 @@
       <w:pPr/>
       <w:r>
         <w:rPr>
-          <w:lang w:val="en_US" w:bidi="en_US"/>
-        </w:rPr>
-      </w:r>
-      <w:r>
-        <w:rPr>
-          <w:vertAlign w:val="superscript"/>
-          <w:lang w:val="en_US" w:bidi="en_US"/>
+          <w:lang w:val="el_GR" w:bidi="el_GR"/>
+        </w:rPr>
+      </w:r>
+      <w:r>
+        <w:rPr>
+          <w:vertAlign w:val="superscript"/>
+          <w:lang w:val="el_GR" w:bidi="el_GR"/>
         </w:rPr>
         <w:t>18</w:t>
       </w:r>
       <w:r>
         <w:rPr>
-          <w:lang w:val="en_US" w:bidi="en_US"/>
+          <w:lang w:val="el_GR" w:bidi="el_GR"/>
         </w:rPr>
         <w:t xml:space="preserve"> εἰ δὲ πνεύματι ἄγεσθε, οὐκ ἐστὲ ὑπὸ νόμον.</w:t>
       </w:r>
@@ -2847,19 +2847,19 @@
       <w:pPr/>
       <w:r>
         <w:rPr>
-          <w:lang w:val="en_US" w:bidi="en_US"/>
-        </w:rPr>
-      </w:r>
-      <w:r>
-        <w:rPr>
-          <w:vertAlign w:val="superscript"/>
-          <w:lang w:val="en_US" w:bidi="en_US"/>
+          <w:lang w:val="el_GR" w:bidi="el_GR"/>
+        </w:rPr>
+      </w:r>
+      <w:r>
+        <w:rPr>
+          <w:vertAlign w:val="superscript"/>
+          <w:lang w:val="el_GR" w:bidi="el_GR"/>
         </w:rPr>
         <w:t>19</w:t>
       </w:r>
       <w:r>
         <w:rPr>
-          <w:lang w:val="en_US" w:bidi="en_US"/>
+          <w:lang w:val="el_GR" w:bidi="el_GR"/>
         </w:rPr>
         <w:t xml:space="preserve"> φανερὰ δέ ἐστιν τὰ ἔργα τῆς σαρκός, ἅτινά ἐστιν πορνεία, ἀκαθαρσία, ἀσέλγεια,</w:t>
       </w:r>
@@ -2868,19 +2868,19 @@
       <w:pPr/>
       <w:r>
         <w:rPr>
-          <w:lang w:val="en_US" w:bidi="en_US"/>
-        </w:rPr>
-      </w:r>
-      <w:r>
-        <w:rPr>
-          <w:vertAlign w:val="superscript"/>
-          <w:lang w:val="en_US" w:bidi="en_US"/>
+          <w:lang w:val="el_GR" w:bidi="el_GR"/>
+        </w:rPr>
+      </w:r>
+      <w:r>
+        <w:rPr>
+          <w:vertAlign w:val="superscript"/>
+          <w:lang w:val="el_GR" w:bidi="el_GR"/>
         </w:rPr>
         <w:t>20</w:t>
       </w:r>
       <w:r>
         <w:rPr>
-          <w:lang w:val="en_US" w:bidi="en_US"/>
+          <w:lang w:val="el_GR" w:bidi="el_GR"/>
         </w:rPr>
         <w:t xml:space="preserve"> εἰδωλολατρία, φαρμακεία, ἔχθραι, ἔρις, ζῆλος, θυμοί, ἐριθεῖαι, διχοστασίαι, αἱρέσεις,</w:t>
       </w:r>
@@ -2889,19 +2889,19 @@
       <w:pPr/>
       <w:r>
         <w:rPr>
-          <w:lang w:val="en_US" w:bidi="en_US"/>
-        </w:rPr>
-      </w:r>
-      <w:r>
-        <w:rPr>
-          <w:vertAlign w:val="superscript"/>
-          <w:lang w:val="en_US" w:bidi="en_US"/>
+          <w:lang w:val="el_GR" w:bidi="el_GR"/>
+        </w:rPr>
+      </w:r>
+      <w:r>
+        <w:rPr>
+          <w:vertAlign w:val="superscript"/>
+          <w:lang w:val="el_GR" w:bidi="el_GR"/>
         </w:rPr>
         <w:t>21</w:t>
       </w:r>
       <w:r>
         <w:rPr>
-          <w:lang w:val="en_US" w:bidi="en_US"/>
+          <w:lang w:val="el_GR" w:bidi="el_GR"/>
         </w:rPr>
         <w:t xml:space="preserve"> φθόνοι, μέθαι, κῶμοι, καὶ τὰ ὅμοια τούτοις, ἃ προλέγω ὑμῖν καθὼς προεῖπον ὅτι οἱ τὰ τοιαῦτα πράσσοντες βασιλείαν θεοῦ οὐ κληρονομήσουσιν.</w:t>
       </w:r>
@@ -2910,19 +2910,19 @@
       <w:pPr/>
       <w:r>
         <w:rPr>
-          <w:lang w:val="en_US" w:bidi="en_US"/>
-        </w:rPr>
-      </w:r>
-      <w:r>
-        <w:rPr>
-          <w:vertAlign w:val="superscript"/>
-          <w:lang w:val="en_US" w:bidi="en_US"/>
+          <w:lang w:val="el_GR" w:bidi="el_GR"/>
+        </w:rPr>
+      </w:r>
+      <w:r>
+        <w:rPr>
+          <w:vertAlign w:val="superscript"/>
+          <w:lang w:val="el_GR" w:bidi="el_GR"/>
         </w:rPr>
         <w:t>22</w:t>
       </w:r>
       <w:r>
         <w:rPr>
-          <w:lang w:val="en_US" w:bidi="en_US"/>
+          <w:lang w:val="el_GR" w:bidi="el_GR"/>
         </w:rPr>
         <w:t xml:space="preserve"> Ὁ δὲ καρπὸς τοῦ πνεύματός ἐστιν ἀγάπη, χαρά, εἰρήνη, μακροθυμία, χρηστότης, ἀγαθωσύνη, πίστις,</w:t>
       </w:r>
@@ -2931,19 +2931,19 @@
       <w:pPr/>
       <w:r>
         <w:rPr>
-          <w:lang w:val="en_US" w:bidi="en_US"/>
-        </w:rPr>
-      </w:r>
-      <w:r>
-        <w:rPr>
-          <w:vertAlign w:val="superscript"/>
-          <w:lang w:val="en_US" w:bidi="en_US"/>
+          <w:lang w:val="el_GR" w:bidi="el_GR"/>
+        </w:rPr>
+      </w:r>
+      <w:r>
+        <w:rPr>
+          <w:vertAlign w:val="superscript"/>
+          <w:lang w:val="el_GR" w:bidi="el_GR"/>
         </w:rPr>
         <w:t>23</w:t>
       </w:r>
       <w:r>
         <w:rPr>
-          <w:lang w:val="en_US" w:bidi="en_US"/>
+          <w:lang w:val="el_GR" w:bidi="el_GR"/>
         </w:rPr>
         <w:t xml:space="preserve"> πραΰτης, ἐγκράτεια· κατὰ τῶν τοιούτων οὐκ ἔστιν νόμος.</w:t>
       </w:r>
@@ -2952,19 +2952,19 @@
       <w:pPr/>
       <w:r>
         <w:rPr>
-          <w:lang w:val="en_US" w:bidi="en_US"/>
-        </w:rPr>
-      </w:r>
-      <w:r>
-        <w:rPr>
-          <w:vertAlign w:val="superscript"/>
-          <w:lang w:val="en_US" w:bidi="en_US"/>
+          <w:lang w:val="el_GR" w:bidi="el_GR"/>
+        </w:rPr>
+      </w:r>
+      <w:r>
+        <w:rPr>
+          <w:vertAlign w:val="superscript"/>
+          <w:lang w:val="el_GR" w:bidi="el_GR"/>
         </w:rPr>
         <w:t>24</w:t>
       </w:r>
       <w:r>
         <w:rPr>
-          <w:lang w:val="en_US" w:bidi="en_US"/>
+          <w:lang w:val="el_GR" w:bidi="el_GR"/>
         </w:rPr>
         <w:t xml:space="preserve"> οἱ δὲ τοῦ Χριστοῦ τὴν σάρκα ἐσταύρωσαν σὺν τοῖς παθήμασιν καὶ ταῖς ἐπιθυμίαις.</w:t>
       </w:r>
@@ -2973,19 +2973,19 @@
       <w:pPr/>
       <w:r>
         <w:rPr>
-          <w:lang w:val="en_US" w:bidi="en_US"/>
-        </w:rPr>
-      </w:r>
-      <w:r>
-        <w:rPr>
-          <w:vertAlign w:val="superscript"/>
-          <w:lang w:val="en_US" w:bidi="en_US"/>
+          <w:lang w:val="el_GR" w:bidi="el_GR"/>
+        </w:rPr>
+      </w:r>
+      <w:r>
+        <w:rPr>
+          <w:vertAlign w:val="superscript"/>
+          <w:lang w:val="el_GR" w:bidi="el_GR"/>
         </w:rPr>
         <w:t>25</w:t>
       </w:r>
       <w:r>
         <w:rPr>
-          <w:lang w:val="en_US" w:bidi="en_US"/>
+          <w:lang w:val="el_GR" w:bidi="el_GR"/>
         </w:rPr>
         <w:t xml:space="preserve"> εἰ ζῶμεν πνεύματι, πνεύματι καὶ στοιχῶμεν.</w:t>
       </w:r>
@@ -2994,19 +2994,19 @@
       <w:pPr/>
       <w:r>
         <w:rPr>
-          <w:lang w:val="en_US" w:bidi="en_US"/>
-        </w:rPr>
-      </w:r>
-      <w:r>
-        <w:rPr>
-          <w:vertAlign w:val="superscript"/>
-          <w:lang w:val="en_US" w:bidi="en_US"/>
+          <w:lang w:val="el_GR" w:bidi="el_GR"/>
+        </w:rPr>
+      </w:r>
+      <w:r>
+        <w:rPr>
+          <w:vertAlign w:val="superscript"/>
+          <w:lang w:val="el_GR" w:bidi="el_GR"/>
         </w:rPr>
         <w:t>26</w:t>
       </w:r>
       <w:r>
         <w:rPr>
-          <w:lang w:val="en_US" w:bidi="en_US"/>
+          <w:lang w:val="el_GR" w:bidi="el_GR"/>
         </w:rPr>
         <w:t xml:space="preserve"> μὴ γινώμεθα κενόδοξοι, ἀλλήλους προκαλούμενοι, ἀλλήλοις φθονοῦντες.</w:t>
       </w:r>
@@ -3017,33 +3017,33 @@
       </w:pPr>
       <w:r>
         <w:rPr>
-          <w:lang w:val="en_US" w:bidi="en_US"/>
+          <w:lang w:val="el_GR" w:bidi="el_GR"/>
         </w:rPr>
         <w:t>Galatians 6:1</w:t>
       </w:r>
       <w:r>
         <w:rPr>
-          <w:lang w:val="en_US" w:bidi="en_US"/>
-        </w:rPr>
-      </w:r>
-    </w:p>
-    <w:p>
-      <w:pPr/>
-      <w:r>
-        <w:rPr>
-          <w:lang w:val="en_US" w:bidi="en_US"/>
-        </w:rPr>
-      </w:r>
-      <w:r>
-        <w:rPr>
-          <w:vertAlign w:val="superscript"/>
-          <w:lang w:val="en_US" w:bidi="en_US"/>
+          <w:lang w:val="el_GR" w:bidi="el_GR"/>
+        </w:rPr>
+      </w:r>
+    </w:p>
+    <w:p>
+      <w:pPr/>
+      <w:r>
+        <w:rPr>
+          <w:lang w:val="el_GR" w:bidi="el_GR"/>
+        </w:rPr>
+      </w:r>
+      <w:r>
+        <w:rPr>
+          <w:vertAlign w:val="superscript"/>
+          <w:lang w:val="el_GR" w:bidi="el_GR"/>
         </w:rPr>
         <w:t>1</w:t>
       </w:r>
       <w:r>
         <w:rPr>
-          <w:lang w:val="en_US" w:bidi="en_US"/>
+          <w:lang w:val="el_GR" w:bidi="el_GR"/>
         </w:rPr>
         <w:t xml:space="preserve"> Ἀδελφοί, ἐὰν καὶ προλημφθῇ ἄνθρωπος ἔν τινι παραπτώματι, ὑμεῖς οἱ πνευματικοὶ καταρτίζετε τὸν τοιοῦτον ἐν πνεύματι πραΰτητος, σκοπῶν σεαυτόν, μὴ καὶ σὺ πειρασθῇς.</w:t>
       </w:r>
@@ -3052,19 +3052,19 @@
       <w:pPr/>
       <w:r>
         <w:rPr>
-          <w:lang w:val="en_US" w:bidi="en_US"/>
-        </w:rPr>
-      </w:r>
-      <w:r>
-        <w:rPr>
-          <w:vertAlign w:val="superscript"/>
-          <w:lang w:val="en_US" w:bidi="en_US"/>
+          <w:lang w:val="el_GR" w:bidi="el_GR"/>
+        </w:rPr>
+      </w:r>
+      <w:r>
+        <w:rPr>
+          <w:vertAlign w:val="superscript"/>
+          <w:lang w:val="el_GR" w:bidi="el_GR"/>
         </w:rPr>
         <w:t>2</w:t>
       </w:r>
       <w:r>
         <w:rPr>
-          <w:lang w:val="en_US" w:bidi="en_US"/>
+          <w:lang w:val="el_GR" w:bidi="el_GR"/>
         </w:rPr>
         <w:t xml:space="preserve"> ἀλλήλων τὰ βάρη βαστάζετε, καὶ οὕτως ἀναπληρώσετε τὸν νόμον τοῦ Χριστοῦ.</w:t>
       </w:r>
@@ -3073,19 +3073,19 @@
       <w:pPr/>
       <w:r>
         <w:rPr>
-          <w:lang w:val="en_US" w:bidi="en_US"/>
-        </w:rPr>
-      </w:r>
-      <w:r>
-        <w:rPr>
-          <w:vertAlign w:val="superscript"/>
-          <w:lang w:val="en_US" w:bidi="en_US"/>
+          <w:lang w:val="el_GR" w:bidi="el_GR"/>
+        </w:rPr>
+      </w:r>
+      <w:r>
+        <w:rPr>
+          <w:vertAlign w:val="superscript"/>
+          <w:lang w:val="el_GR" w:bidi="el_GR"/>
         </w:rPr>
         <w:t>3</w:t>
       </w:r>
       <w:r>
         <w:rPr>
-          <w:lang w:val="en_US" w:bidi="en_US"/>
+          <w:lang w:val="el_GR" w:bidi="el_GR"/>
         </w:rPr>
         <w:t xml:space="preserve"> εἰ γὰρ δοκεῖ τις εἶναί τι μηδὲν ὤν, φρεναπατᾷ ἑαυτόν·</w:t>
       </w:r>
@@ -3094,19 +3094,19 @@
       <w:pPr/>
       <w:r>
         <w:rPr>
-          <w:lang w:val="en_US" w:bidi="en_US"/>
-        </w:rPr>
-      </w:r>
-      <w:r>
-        <w:rPr>
-          <w:vertAlign w:val="superscript"/>
-          <w:lang w:val="en_US" w:bidi="en_US"/>
+          <w:lang w:val="el_GR" w:bidi="el_GR"/>
+        </w:rPr>
+      </w:r>
+      <w:r>
+        <w:rPr>
+          <w:vertAlign w:val="superscript"/>
+          <w:lang w:val="el_GR" w:bidi="el_GR"/>
         </w:rPr>
         <w:t>4</w:t>
       </w:r>
       <w:r>
         <w:rPr>
-          <w:lang w:val="en_US" w:bidi="en_US"/>
+          <w:lang w:val="el_GR" w:bidi="el_GR"/>
         </w:rPr>
         <w:t xml:space="preserve"> τὸ δὲ ἔργον ἑαυτοῦ δοκιμαζέτω ἕκαστος, καὶ τότε εἰς ἑαυτὸν μόνον τὸ καύχημα ἕξει καὶ οὐκ εἰς τὸν ἕτερον,</w:t>
       </w:r>
@@ -3115,19 +3115,19 @@
       <w:pPr/>
       <w:r>
         <w:rPr>
-          <w:lang w:val="en_US" w:bidi="en_US"/>
-        </w:rPr>
-      </w:r>
-      <w:r>
-        <w:rPr>
-          <w:vertAlign w:val="superscript"/>
-          <w:lang w:val="en_US" w:bidi="en_US"/>
+          <w:lang w:val="el_GR" w:bidi="el_GR"/>
+        </w:rPr>
+      </w:r>
+      <w:r>
+        <w:rPr>
+          <w:vertAlign w:val="superscript"/>
+          <w:lang w:val="el_GR" w:bidi="el_GR"/>
         </w:rPr>
         <w:t>5</w:t>
       </w:r>
       <w:r>
         <w:rPr>
-          <w:lang w:val="en_US" w:bidi="en_US"/>
+          <w:lang w:val="el_GR" w:bidi="el_GR"/>
         </w:rPr>
         <w:t xml:space="preserve"> ἕκαστος γὰρ τὸ ἴδιον φορτίον βαστάσει.</w:t>
       </w:r>
@@ -3136,19 +3136,19 @@
       <w:pPr/>
       <w:r>
         <w:rPr>
-          <w:lang w:val="en_US" w:bidi="en_US"/>
-        </w:rPr>
-      </w:r>
-      <w:r>
-        <w:rPr>
-          <w:vertAlign w:val="superscript"/>
-          <w:lang w:val="en_US" w:bidi="en_US"/>
+          <w:lang w:val="el_GR" w:bidi="el_GR"/>
+        </w:rPr>
+      </w:r>
+      <w:r>
+        <w:rPr>
+          <w:vertAlign w:val="superscript"/>
+          <w:lang w:val="el_GR" w:bidi="el_GR"/>
         </w:rPr>
         <w:t>6</w:t>
       </w:r>
       <w:r>
         <w:rPr>
-          <w:lang w:val="en_US" w:bidi="en_US"/>
+          <w:lang w:val="el_GR" w:bidi="el_GR"/>
         </w:rPr>
         <w:t xml:space="preserve"> Κοινωνείτω δὲ ὁ κατηχούμενος τὸν λόγον τῷ κατηχοῦντι ἐν πᾶσιν ἀγαθοῖς.</w:t>
       </w:r>
@@ -3157,19 +3157,19 @@
       <w:pPr/>
       <w:r>
         <w:rPr>
-          <w:lang w:val="en_US" w:bidi="en_US"/>
-        </w:rPr>
-      </w:r>
-      <w:r>
-        <w:rPr>
-          <w:vertAlign w:val="superscript"/>
-          <w:lang w:val="en_US" w:bidi="en_US"/>
+          <w:lang w:val="el_GR" w:bidi="el_GR"/>
+        </w:rPr>
+      </w:r>
+      <w:r>
+        <w:rPr>
+          <w:vertAlign w:val="superscript"/>
+          <w:lang w:val="el_GR" w:bidi="el_GR"/>
         </w:rPr>
         <w:t>7</w:t>
       </w:r>
       <w:r>
         <w:rPr>
-          <w:lang w:val="en_US" w:bidi="en_US"/>
+          <w:lang w:val="el_GR" w:bidi="el_GR"/>
         </w:rPr>
         <w:t xml:space="preserve"> μὴ πλανᾶσθε, θεὸς οὐ μυκτηρίζεται· ὃ γὰρ ἐὰν σπείρῃ ἄνθρωπος, τοῦτο καὶ θερίσει·</w:t>
       </w:r>
@@ -3178,19 +3178,19 @@
       <w:pPr/>
       <w:r>
         <w:rPr>
-          <w:lang w:val="en_US" w:bidi="en_US"/>
-        </w:rPr>
-      </w:r>
-      <w:r>
-        <w:rPr>
-          <w:vertAlign w:val="superscript"/>
-          <w:lang w:val="en_US" w:bidi="en_US"/>
+          <w:lang w:val="el_GR" w:bidi="el_GR"/>
+        </w:rPr>
+      </w:r>
+      <w:r>
+        <w:rPr>
+          <w:vertAlign w:val="superscript"/>
+          <w:lang w:val="el_GR" w:bidi="el_GR"/>
         </w:rPr>
         <w:t>8</w:t>
       </w:r>
       <w:r>
         <w:rPr>
-          <w:lang w:val="en_US" w:bidi="en_US"/>
+          <w:lang w:val="el_GR" w:bidi="el_GR"/>
         </w:rPr>
         <w:t xml:space="preserve"> ὅτι ὁ σπείρων εἰς τὴν σάρκα ἑαυτοῦ ἐκ τῆς σαρκὸς θερίσει φθοράν, ὁ δὲ σπείρων εἰς τὸ πνεῦμα ἐκ τοῦ πνεύματος θερίσει ζωὴν αἰώνιον.</w:t>
       </w:r>
@@ -3199,19 +3199,19 @@
       <w:pPr/>
       <w:r>
         <w:rPr>
-          <w:lang w:val="en_US" w:bidi="en_US"/>
-        </w:rPr>
-      </w:r>
-      <w:r>
-        <w:rPr>
-          <w:vertAlign w:val="superscript"/>
-          <w:lang w:val="en_US" w:bidi="en_US"/>
+          <w:lang w:val="el_GR" w:bidi="el_GR"/>
+        </w:rPr>
+      </w:r>
+      <w:r>
+        <w:rPr>
+          <w:vertAlign w:val="superscript"/>
+          <w:lang w:val="el_GR" w:bidi="el_GR"/>
         </w:rPr>
         <w:t>9</w:t>
       </w:r>
       <w:r>
         <w:rPr>
-          <w:lang w:val="en_US" w:bidi="en_US"/>
+          <w:lang w:val="el_GR" w:bidi="el_GR"/>
         </w:rPr>
         <w:t xml:space="preserve"> τὸ δὲ καλὸν ποιοῦντες μὴ ἐγκακῶμεν, καιρῷ γὰρ ἰδίῳ θερίσομεν μὴ ἐκλυόμενοι.</w:t>
       </w:r>
@@ -3220,19 +3220,19 @@
       <w:pPr/>
       <w:r>
         <w:rPr>
-          <w:lang w:val="en_US" w:bidi="en_US"/>
-        </w:rPr>
-      </w:r>
-      <w:r>
-        <w:rPr>
-          <w:vertAlign w:val="superscript"/>
-          <w:lang w:val="en_US" w:bidi="en_US"/>
+          <w:lang w:val="el_GR" w:bidi="el_GR"/>
+        </w:rPr>
+      </w:r>
+      <w:r>
+        <w:rPr>
+          <w:vertAlign w:val="superscript"/>
+          <w:lang w:val="el_GR" w:bidi="el_GR"/>
         </w:rPr>
         <w:t>10</w:t>
       </w:r>
       <w:r>
         <w:rPr>
-          <w:lang w:val="en_US" w:bidi="en_US"/>
+          <w:lang w:val="el_GR" w:bidi="el_GR"/>
         </w:rPr>
         <w:t xml:space="preserve"> ἄρα οὖν ὡς καιρὸν ἔχομεν, ἐργαζώμεθα τὸ ἀγαθὸν πρὸς πάντας, μάλιστα δὲ πρὸς τοὺς οἰκείους τῆς πίστεως.</w:t>
       </w:r>
@@ -3241,19 +3241,19 @@
       <w:pPr/>
       <w:r>
         <w:rPr>
-          <w:lang w:val="en_US" w:bidi="en_US"/>
-        </w:rPr>
-      </w:r>
-      <w:r>
-        <w:rPr>
-          <w:vertAlign w:val="superscript"/>
-          <w:lang w:val="en_US" w:bidi="en_US"/>
+          <w:lang w:val="el_GR" w:bidi="el_GR"/>
+        </w:rPr>
+      </w:r>
+      <w:r>
+        <w:rPr>
+          <w:vertAlign w:val="superscript"/>
+          <w:lang w:val="el_GR" w:bidi="el_GR"/>
         </w:rPr>
         <w:t>11</w:t>
       </w:r>
       <w:r>
         <w:rPr>
-          <w:lang w:val="en_US" w:bidi="en_US"/>
+          <w:lang w:val="el_GR" w:bidi="el_GR"/>
         </w:rPr>
         <w:t xml:space="preserve"> Ἴδετε πηλίκοις ὑμῖν γράμμασιν ἔγραψα τῇ ἐμῇ χειρί.</w:t>
       </w:r>
@@ -3262,19 +3262,19 @@
       <w:pPr/>
       <w:r>
         <w:rPr>
-          <w:lang w:val="en_US" w:bidi="en_US"/>
-        </w:rPr>
-      </w:r>
-      <w:r>
-        <w:rPr>
-          <w:vertAlign w:val="superscript"/>
-          <w:lang w:val="en_US" w:bidi="en_US"/>
+          <w:lang w:val="el_GR" w:bidi="el_GR"/>
+        </w:rPr>
+      </w:r>
+      <w:r>
+        <w:rPr>
+          <w:vertAlign w:val="superscript"/>
+          <w:lang w:val="el_GR" w:bidi="el_GR"/>
         </w:rPr>
         <w:t>12</w:t>
       </w:r>
       <w:r>
         <w:rPr>
-          <w:lang w:val="en_US" w:bidi="en_US"/>
+          <w:lang w:val="el_GR" w:bidi="el_GR"/>
         </w:rPr>
         <w:t xml:space="preserve"> ὅσοι θέλουσιν εὐπροσωπῆσαι ἐν σαρκί, οὗτοι ἀναγκάζουσιν ὑμᾶς περιτέμνεσθαι, μόνον ἵνα τῷ σταυρῷ τοῦ Χριστοῦ μὴ διώκωνται·</w:t>
       </w:r>
@@ -3283,19 +3283,19 @@
       <w:pPr/>
       <w:r>
         <w:rPr>
-          <w:lang w:val="en_US" w:bidi="en_US"/>
-        </w:rPr>
-      </w:r>
-      <w:r>
-        <w:rPr>
-          <w:vertAlign w:val="superscript"/>
-          <w:lang w:val="en_US" w:bidi="en_US"/>
+          <w:lang w:val="el_GR" w:bidi="el_GR"/>
+        </w:rPr>
+      </w:r>
+      <w:r>
+        <w:rPr>
+          <w:vertAlign w:val="superscript"/>
+          <w:lang w:val="el_GR" w:bidi="el_GR"/>
         </w:rPr>
         <w:t>13</w:t>
       </w:r>
       <w:r>
         <w:rPr>
-          <w:lang w:val="en_US" w:bidi="en_US"/>
+          <w:lang w:val="el_GR" w:bidi="el_GR"/>
         </w:rPr>
         <w:t xml:space="preserve"> οὐδὲ γὰρ οἱ περιτεμνόμενοι αὐτοὶ νόμον φυλάσσουσιν, ἀλλὰ θέλουσιν ὑμᾶς περιτέμνεσθαι ἵνα ἐν τῇ ὑμετέρᾳ σαρκὶ καυχήσωνται.</w:t>
       </w:r>
@@ -3304,19 +3304,19 @@
       <w:pPr/>
       <w:r>
         <w:rPr>
-          <w:lang w:val="en_US" w:bidi="en_US"/>
-        </w:rPr>
-      </w:r>
-      <w:r>
-        <w:rPr>
-          <w:vertAlign w:val="superscript"/>
-          <w:lang w:val="en_US" w:bidi="en_US"/>
+          <w:lang w:val="el_GR" w:bidi="el_GR"/>
+        </w:rPr>
+      </w:r>
+      <w:r>
+        <w:rPr>
+          <w:vertAlign w:val="superscript"/>
+          <w:lang w:val="el_GR" w:bidi="el_GR"/>
         </w:rPr>
         <w:t>14</w:t>
       </w:r>
       <w:r>
         <w:rPr>
-          <w:lang w:val="en_US" w:bidi="en_US"/>
+          <w:lang w:val="el_GR" w:bidi="el_GR"/>
         </w:rPr>
         <w:t xml:space="preserve"> ἐμοὶ δὲ μὴ γένοιτο καυχᾶσθαι εἰ μὴ ἐν τῷ σταυρῷ τοῦ κυρίου ἡμῶν Ἰησοῦ Χριστοῦ, διʼ οὗ ἐμοὶ κόσμος ἐσταύρωται κἀγὼ κόσμῳ.</w:t>
       </w:r>
@@ -3325,19 +3325,19 @@
       <w:pPr/>
       <w:r>
         <w:rPr>
-          <w:lang w:val="en_US" w:bidi="en_US"/>
-        </w:rPr>
-      </w:r>
-      <w:r>
-        <w:rPr>
-          <w:vertAlign w:val="superscript"/>
-          <w:lang w:val="en_US" w:bidi="en_US"/>
+          <w:lang w:val="el_GR" w:bidi="el_GR"/>
+        </w:rPr>
+      </w:r>
+      <w:r>
+        <w:rPr>
+          <w:vertAlign w:val="superscript"/>
+          <w:lang w:val="el_GR" w:bidi="el_GR"/>
         </w:rPr>
         <w:t>15</w:t>
       </w:r>
       <w:r>
         <w:rPr>
-          <w:lang w:val="en_US" w:bidi="en_US"/>
+          <w:lang w:val="el_GR" w:bidi="el_GR"/>
         </w:rPr>
         <w:t xml:space="preserve"> οὔτε γὰρ περιτομή τί ἐστιν οὔτε ἀκροβυστία, ἀλλὰ καινὴ κτίσις.</w:t>
       </w:r>
@@ -3346,19 +3346,19 @@
       <w:pPr/>
       <w:r>
         <w:rPr>
-          <w:lang w:val="en_US" w:bidi="en_US"/>
-        </w:rPr>
-      </w:r>
-      <w:r>
-        <w:rPr>
-          <w:vertAlign w:val="superscript"/>
-          <w:lang w:val="en_US" w:bidi="en_US"/>
+          <w:lang w:val="el_GR" w:bidi="el_GR"/>
+        </w:rPr>
+      </w:r>
+      <w:r>
+        <w:rPr>
+          <w:vertAlign w:val="superscript"/>
+          <w:lang w:val="el_GR" w:bidi="el_GR"/>
         </w:rPr>
         <w:t>16</w:t>
       </w:r>
       <w:r>
         <w:rPr>
-          <w:lang w:val="en_US" w:bidi="en_US"/>
+          <w:lang w:val="el_GR" w:bidi="el_GR"/>
         </w:rPr>
         <w:t xml:space="preserve"> καὶ ὅσοι τῷ κανόνι τούτῳ στοιχήσουσιν, εἰρήνη ἐπʼ αὐτοὺς καὶ ἔλεος, καὶ ἐπὶ τὸν Ἰσραὴλ τοῦ θεοῦ.</w:t>
       </w:r>
@@ -3367,19 +3367,19 @@
       <w:pPr/>
       <w:r>
         <w:rPr>
-          <w:lang w:val="en_US" w:bidi="en_US"/>
-        </w:rPr>
-      </w:r>
-      <w:r>
-        <w:rPr>
-          <w:vertAlign w:val="superscript"/>
-          <w:lang w:val="en_US" w:bidi="en_US"/>
+          <w:lang w:val="el_GR" w:bidi="el_GR"/>
+        </w:rPr>
+      </w:r>
+      <w:r>
+        <w:rPr>
+          <w:vertAlign w:val="superscript"/>
+          <w:lang w:val="el_GR" w:bidi="el_GR"/>
         </w:rPr>
         <w:t>17</w:t>
       </w:r>
       <w:r>
         <w:rPr>
-          <w:lang w:val="en_US" w:bidi="en_US"/>
+          <w:lang w:val="el_GR" w:bidi="el_GR"/>
         </w:rPr>
         <w:t xml:space="preserve"> Τοῦ λοιποῦ κόπους μοι μηδεὶς παρεχέτω, ἐγὼ γὰρ τὰ στίγματα τοῦ Ἰησοῦ ἐν τῷ σώματί μου βαστάζω.</w:t>
       </w:r>
@@ -3388,19 +3388,19 @@
       <w:pPr/>
       <w:r>
         <w:rPr>
-          <w:lang w:val="en_US" w:bidi="en_US"/>
-        </w:rPr>
-      </w:r>
-      <w:r>
-        <w:rPr>
-          <w:vertAlign w:val="superscript"/>
-          <w:lang w:val="en_US" w:bidi="en_US"/>
+          <w:lang w:val="el_GR" w:bidi="el_GR"/>
+        </w:rPr>
+      </w:r>
+      <w:r>
+        <w:rPr>
+          <w:vertAlign w:val="superscript"/>
+          <w:lang w:val="el_GR" w:bidi="el_GR"/>
         </w:rPr>
         <w:t>18</w:t>
       </w:r>
       <w:r>
         <w:rPr>
-          <w:lang w:val="en_US" w:bidi="en_US"/>
+          <w:lang w:val="el_GR" w:bidi="el_GR"/>
         </w:rPr>
         <w:t xml:space="preserve"> Ἡ χάρις τοῦ κυρίου ἡμῶν Ἰησοῦ Χριστοῦ μετὰ τοῦ πνεύματος ὑμῶν, ἀδελφοί· ἀμήν.</w:t>
       </w:r>
@@ -5305,7 +5305,7 @@
     <w:rPrDefault>
       <w:rPr>
         <w:rFonts w:ascii="Times New Roman" w:eastAsia="Times New Roman" w:hAnsi="Times New Roman" w:cs="Times New Roman"/>
-        <w:lang w:val="en_US" w:eastAsia="en-US" w:bidi="ar-SA"/>
+        <w:lang w:val="el_GR" w:eastAsia="en-US" w:bidi="ar-SA"/>
       </w:rPr>
     </w:rPrDefault>
     <w:pPrDefault/>

</xml_diff>